<commit_message>
Deploy documentation from main
</commit_message>
<xml_diff>
--- a/commonspec/downloads/commonspec.docx
+++ b/commonspec/downloads/commonspec.docx
@@ -16,14 +16,14 @@
       <w:pPr>
         <w:pStyle w:val="TOCHeading"/>
       </w:pPr>
-      <w:bookmarkStart w:name="index" w:id="46067"/>
+      <w:bookmarkStart w:id="28179" w:name="SPEC-sec1"/>
       <w:r>
         <w:rPr>
           <w:color w:val="000000"/>
         </w:rPr>
         <w:t xml:space="preserve">INDEX</w:t>
       </w:r>
-      <w:bookmarkEnd w:id="46067"/>
+      <w:bookmarkEnd w:id="28179"/>
     </w:p>
     <w:p>
       <w:r>
@@ -46,7 +46,7 @@
         <w:br w:type="page"/>
       </w:r>
     </w:p>
-    <w:bookmarkStart w:id="24" w:name="introduction"/>
+    <w:bookmarkStart w:id="24" w:name="SPEC-sec2"/>
     <w:p>
       <w:pPr>
         <w:pStyle w:val="Heading1"/>
@@ -59,7 +59,7 @@
         <w:t xml:space="preserve">Introduction</w:t>
       </w:r>
     </w:p>
-    <w:bookmarkStart w:id="21" w:name="what-is-commonspec"/>
+    <w:bookmarkStart w:id="21" w:name="SPEC-sec2.1"/>
     <w:p>
       <w:pPr>
         <w:pStyle w:val="Heading2"/>
@@ -99,7 +99,7 @@
       </w:r>
     </w:p>
     <w:bookmarkEnd w:id="21"/>
-    <w:bookmarkStart w:id="22" w:name="design-principles"/>
+    <w:bookmarkStart w:id="22" w:name="SPEC-sec2.2"/>
     <w:p>
       <w:pPr>
         <w:pStyle w:val="Heading2"/>
@@ -185,7 +185,7 @@
       </w:r>
     </w:p>
     <w:bookmarkEnd w:id="22"/>
-    <w:bookmarkStart w:id="23" w:name="notation"/>
+    <w:bookmarkStart w:id="23" w:name="SPEC-sec2.3"/>
     <w:p>
       <w:pPr>
         <w:pStyle w:val="Heading2"/>
@@ -620,7 +620,7 @@
     </w:p>
     <w:bookmarkEnd w:id="23"/>
     <w:bookmarkEnd w:id="24"/>
-    <w:bookmarkStart w:id="79" w:name="language-constructs"/>
+    <w:bookmarkStart w:id="79" w:name="SPEC-sec3"/>
     <w:p>
       <w:pPr>
         <w:pStyle w:val="Heading1"/>
@@ -641,7 +641,7 @@
         <w:t xml:space="preserve">CommonSpec defines six constructs. Each is produced by a specific Markdown syntax pattern.</w:t>
       </w:r>
     </w:p>
-    <w:bookmarkStart w:id="25" w:name="lexical-rules"/>
+    <w:bookmarkStart w:id="25" w:name="SPEC-sec3.1"/>
     <w:p>
       <w:pPr>
         <w:pStyle w:val="Heading2"/>
@@ -1310,7 +1310,7 @@
       </w:r>
     </w:p>
     <w:bookmarkEnd w:id="25"/>
-    <w:bookmarkStart w:id="32" w:name="specification"/>
+    <w:bookmarkStart w:id="32" w:name="SPEC-sec3.2"/>
     <w:p>
       <w:pPr>
         <w:pStyle w:val="Heading2"/>
@@ -1362,7 +1362,7 @@
         <w:t xml:space="preserve">file produces exactly one specification.</w:t>
       </w:r>
     </w:p>
-    <w:bookmarkStart w:id="26" w:name="formal-definition"/>
+    <w:bookmarkStart w:id="26" w:name="SPEC-sec3.2.1"/>
     <w:p>
       <w:pPr>
         <w:pStyle w:val="Heading3"/>
@@ -1673,7 +1673,7 @@
       </w:r>
     </w:p>
     <w:bookmarkEnd w:id="26"/>
-    <w:bookmarkStart w:id="30" w:name="grammar"/>
+    <w:bookmarkStart w:id="30" w:name="SPEC-sec3.2.2"/>
     <w:p>
       <w:pPr>
         <w:pStyle w:val="Heading3"/>
@@ -1688,12 +1688,12 @@
     </w:p>
     <w:p>
       <w:pPr>
-        <w:spacing w:after="0" w:before="0" w:line="20" w:lineRule="exact"/>
+        <w:spacing w:after="0" w:before="0" w:lineRule="exact" w:line="20"/>
         <w:rPr>
           <w:sz w:val="2"/>
         </w:rPr>
       </w:pPr>
-      <w:bookmarkStart w:name="puml-grammar-spec" w:id="36907"/>
+      <w:bookmarkStart w:id="36907" w:name="puml-grammar-spec"/>
       <w:bookmarkEnd w:id="36907"/>
     </w:p>
     <w:p>
@@ -1772,7 +1772,7 @@
       </w:r>
     </w:p>
     <w:bookmarkEnd w:id="30"/>
-    <w:bookmarkStart w:id="31" w:name="examples"/>
+    <w:bookmarkStart w:id="31" w:name="SPEC-sec3.2.3"/>
     <w:p>
       <w:pPr>
         <w:pStyle w:val="Heading3"/>
@@ -1849,7 +1849,7 @@
     </w:p>
     <w:bookmarkEnd w:id="31"/>
     <w:bookmarkEnd w:id="32"/>
-    <w:bookmarkStart w:id="42" w:name="spec-object"/>
+    <w:bookmarkStart w:id="42" w:name="SPEC-sec3.3"/>
     <w:p>
       <w:pPr>
         <w:pStyle w:val="Heading2"/>
@@ -1886,7 +1886,7 @@
         <w:t xml:space="preserve">is a traceable element within a specification, created from H2–H6 headers. Objects can be requirements (HLR, LLR), verification cases (VC), design elements (FD, CSC, CSU), or structural sections (SECTION). Each object has a type, an optional PID, and can contain attributes, body content, floats, relations, views, and child objects.</w:t>
       </w:r>
     </w:p>
-    <w:bookmarkStart w:id="33" w:name="formal-definition-1"/>
+    <w:bookmarkStart w:id="33" w:name="SPEC-sec3.3.1"/>
     <w:p>
       <w:pPr>
         <w:pStyle w:val="Heading3"/>
@@ -2381,7 +2381,7 @@
       </w:r>
     </w:p>
     <w:bookmarkEnd w:id="33"/>
-    <w:bookmarkStart w:id="37" w:name="grammar-1"/>
+    <w:bookmarkStart w:id="37" w:name="SPEC-sec3.3.2"/>
     <w:p>
       <w:pPr>
         <w:pStyle w:val="Heading3"/>
@@ -2396,12 +2396,12 @@
     </w:p>
     <w:p>
       <w:pPr>
-        <w:spacing w:after="0" w:before="0" w:line="20" w:lineRule="exact"/>
+        <w:spacing w:after="0" w:before="0" w:lineRule="exact" w:line="20"/>
         <w:rPr>
           <w:sz w:val="2"/>
         </w:rPr>
       </w:pPr>
-      <w:bookmarkStart w:name="puml-grammar-spec-object" w:id="45123"/>
+      <w:bookmarkStart w:id="45123" w:name="puml-grammar-spec-object"/>
       <w:bookmarkEnd w:id="45123"/>
     </w:p>
     <w:p>
@@ -2480,7 +2480,7 @@
       </w:r>
     </w:p>
     <w:bookmarkEnd w:id="37"/>
-    <w:bookmarkStart w:id="38" w:name="type-inference"/>
+    <w:bookmarkStart w:id="38" w:name="SPEC-sec3.3.3"/>
     <w:p>
       <w:pPr>
         <w:pStyle w:val="Heading3"/>
@@ -2579,7 +2579,7 @@
       </w:r>
     </w:p>
     <w:bookmarkEnd w:id="38"/>
-    <w:bookmarkStart w:id="39" w:name="pid-auto-generation"/>
+    <w:bookmarkStart w:id="39" w:name="SPEC-sec3.3.4"/>
     <w:p>
       <w:pPr>
         <w:pStyle w:val="Heading3"/>
@@ -2673,7 +2673,7 @@
       </w:r>
     </w:p>
     <w:bookmarkEnd w:id="39"/>
-    <w:bookmarkStart w:id="40" w:name="examples-1"/>
+    <w:bookmarkStart w:id="40" w:name="SPEC-sec3.3.5"/>
     <w:p>
       <w:pPr>
         <w:pStyle w:val="Heading3"/>
@@ -2816,7 +2816,7 @@
       </w:r>
     </w:p>
     <w:bookmarkEnd w:id="40"/>
-    <w:bookmarkStart w:id="41" w:name="scope-and-section-close"/>
+    <w:bookmarkStart w:id="41" w:name="SPEC-sec3.3.6"/>
     <w:p>
       <w:pPr>
         <w:pStyle w:val="Heading3"/>
@@ -3049,7 +3049,7 @@
     </w:p>
     <w:bookmarkEnd w:id="41"/>
     <w:bookmarkEnd w:id="42"/>
-    <w:bookmarkStart w:id="50" w:name="spec-float"/>
+    <w:bookmarkStart w:id="50" w:name="SPEC-sec3.4"/>
     <w:p>
       <w:pPr>
         <w:pStyle w:val="Heading2"/>
@@ -3101,7 +3101,7 @@
         <w:t xml:space="preserve">info string. They are automatically numbered within their counter group and can be cross-referenced by label.</w:t>
       </w:r>
     </w:p>
-    <w:bookmarkStart w:id="43" w:name="formal-definition-2"/>
+    <w:bookmarkStart w:id="43" w:name="SPEC-sec3.4.1"/>
     <w:p>
       <w:pPr>
         <w:pStyle w:val="Heading3"/>
@@ -3355,7 +3355,7 @@
       </w:r>
     </w:p>
     <w:bookmarkEnd w:id="43"/>
-    <w:bookmarkStart w:id="47" w:name="grammar-2"/>
+    <w:bookmarkStart w:id="47" w:name="SPEC-sec3.4.2"/>
     <w:p>
       <w:pPr>
         <w:pStyle w:val="Heading3"/>
@@ -3370,12 +3370,12 @@
     </w:p>
     <w:p>
       <w:pPr>
-        <w:spacing w:after="0" w:before="0" w:line="20" w:lineRule="exact"/>
+        <w:spacing w:after="0" w:before="0" w:lineRule="exact" w:line="20"/>
         <w:rPr>
           <w:sz w:val="2"/>
         </w:rPr>
       </w:pPr>
-      <w:bookmarkStart w:name="puml-grammar-spec-float" w:id="89146"/>
+      <w:bookmarkStart w:id="89146" w:name="puml-grammar-spec-float"/>
       <w:bookmarkEnd w:id="89146"/>
     </w:p>
     <w:p>
@@ -3454,7 +3454,7 @@
       </w:r>
     </w:p>
     <w:bookmarkEnd w:id="47"/>
-    <w:bookmarkStart w:id="48" w:name="float-types-and-aliases"/>
+    <w:bookmarkStart w:id="48" w:name="SPEC-sec3.4.3"/>
     <w:p>
       <w:pPr>
         <w:pStyle w:val="Heading3"/>
@@ -3785,7 +3785,7 @@
       </w:r>
     </w:p>
     <w:bookmarkEnd w:id="48"/>
-    <w:bookmarkStart w:id="49" w:name="examples-2"/>
+    <w:bookmarkStart w:id="49" w:name="SPEC-sec3.4.4"/>
     <w:p>
       <w:pPr>
         <w:pStyle w:val="Heading3"/>
@@ -3974,7 +3974,7 @@
     </w:p>
     <w:bookmarkEnd w:id="49"/>
     <w:bookmarkEnd w:id="50"/>
-    <w:bookmarkStart w:id="60" w:name="attribute"/>
+    <w:bookmarkStart w:id="60" w:name="SPEC-sec3.5"/>
     <w:p>
       <w:pPr>
         <w:pStyle w:val="Heading2"/>
@@ -4011,7 +4011,7 @@
         <w:t xml:space="preserve">stores metadata for specifications and spec objects using an Entity-Attribute-Value (EAV) pattern. Attributes are declared in blockquotes following headers and support seven datatypes.</w:t>
       </w:r>
     </w:p>
-    <w:bookmarkStart w:id="51" w:name="formal-definition-3"/>
+    <w:bookmarkStart w:id="51" w:name="SPEC-sec3.5.1"/>
     <w:p>
       <w:pPr>
         <w:pStyle w:val="Heading3"/>
@@ -4251,7 +4251,7 @@
       </w:r>
     </w:p>
     <w:bookmarkEnd w:id="51"/>
-    <w:bookmarkStart w:id="55" w:name="grammar-3"/>
+    <w:bookmarkStart w:id="55" w:name="SPEC-sec3.5.2"/>
     <w:p>
       <w:pPr>
         <w:pStyle w:val="Heading3"/>
@@ -4266,12 +4266,12 @@
     </w:p>
     <w:p>
       <w:pPr>
-        <w:spacing w:after="0" w:before="0" w:line="20" w:lineRule="exact"/>
+        <w:spacing w:after="0" w:before="0" w:lineRule="exact" w:line="20"/>
         <w:rPr>
           <w:sz w:val="2"/>
         </w:rPr>
       </w:pPr>
-      <w:bookmarkStart w:name="puml-grammar-attribute" w:id="27150"/>
+      <w:bookmarkStart w:id="27150" w:name="puml-grammar-attribute"/>
       <w:bookmarkEnd w:id="27150"/>
     </w:p>
     <w:p>
@@ -4388,7 +4388,7 @@
       </w:r>
     </w:p>
     <w:bookmarkEnd w:id="55"/>
-    <w:bookmarkStart w:id="56" w:name="datatypes"/>
+    <w:bookmarkStart w:id="56" w:name="SPEC-sec3.5.3"/>
     <w:p>
       <w:pPr>
         <w:pStyle w:val="Heading3"/>
@@ -4648,7 +4648,7 @@
       </w:r>
     </w:p>
     <w:bookmarkEnd w:id="56"/>
-    <w:bookmarkStart w:id="57" w:name="attribute-constraints"/>
+    <w:bookmarkStart w:id="57" w:name="SPEC-sec3.5.4"/>
     <w:p>
       <w:pPr>
         <w:pStyle w:val="Heading3"/>
@@ -4750,7 +4750,7 @@
       </w:r>
     </w:p>
     <w:bookmarkEnd w:id="57"/>
-    <w:bookmarkStart w:id="58" w:name="multi-value-attributes"/>
+    <w:bookmarkStart w:id="58" w:name="SPEC-sec3.5.5"/>
     <w:p>
       <w:pPr>
         <w:pStyle w:val="Heading3"/>
@@ -4807,7 +4807,7 @@
       </w:r>
     </w:p>
     <w:bookmarkEnd w:id="58"/>
-    <w:bookmarkStart w:id="59" w:name="examples-3"/>
+    <w:bookmarkStart w:id="59" w:name="SPEC-sec3.5.6"/>
     <w:p>
       <w:pPr>
         <w:pStyle w:val="Heading3"/>
@@ -4921,7 +4921,7 @@
     </w:p>
     <w:bookmarkEnd w:id="59"/>
     <w:bookmarkEnd w:id="60"/>
-    <w:bookmarkStart w:id="69" w:name="spec-relation"/>
+    <w:bookmarkStart w:id="69" w:name="SPEC-sec3.6"/>
     <w:p>
       <w:pPr>
         <w:pStyle w:val="Heading2"/>
@@ -4974,7 +4974,7 @@
         <w:t xml:space="preserve">that drives type inference. The relation type is not authored explicitly — it is inferred from the selector, the source context, and the resolved target.</w:t>
       </w:r>
     </w:p>
-    <w:bookmarkStart w:id="61" w:name="formal-definition-4"/>
+    <w:bookmarkStart w:id="61" w:name="SPEC-sec3.6.1"/>
     <w:p>
       <w:pPr>
         <w:pStyle w:val="Heading3"/>
@@ -5397,7 +5397,7 @@
       </w:r>
     </w:p>
     <w:bookmarkEnd w:id="61"/>
-    <w:bookmarkStart w:id="65" w:name="grammar-4"/>
+    <w:bookmarkStart w:id="65" w:name="SPEC-sec3.6.2"/>
     <w:p>
       <w:pPr>
         <w:pStyle w:val="Heading3"/>
@@ -5412,12 +5412,12 @@
     </w:p>
     <w:p>
       <w:pPr>
-        <w:spacing w:after="0" w:before="0" w:line="20" w:lineRule="exact"/>
+        <w:spacing w:after="0" w:before="0" w:lineRule="exact" w:line="20"/>
         <w:rPr>
           <w:sz w:val="2"/>
         </w:rPr>
       </w:pPr>
-      <w:bookmarkStart w:name="puml-grammar-spec-relation" w:id="79264"/>
+      <w:bookmarkStart w:id="79264" w:name="puml-grammar-spec-relation"/>
       <w:bookmarkEnd w:id="79264"/>
     </w:p>
     <w:p>
@@ -5496,7 +5496,7 @@
       </w:r>
     </w:p>
     <w:bookmarkEnd w:id="65"/>
-    <w:bookmarkStart w:id="66" w:name="link-selectors"/>
+    <w:bookmarkStart w:id="66" w:name="SPEC-sec3.6.3"/>
     <w:p>
       <w:pPr>
         <w:pStyle w:val="Heading3"/>
@@ -5888,7 +5888,7 @@
       </w:r>
     </w:p>
     <w:bookmarkEnd w:id="66"/>
-    <w:bookmarkStart w:id="67" w:name="type-inference-1"/>
+    <w:bookmarkStart w:id="67" w:name="SPEC-sec3.6.4"/>
     <w:p>
       <w:pPr>
         <w:pStyle w:val="Heading3"/>
@@ -6214,13 +6214,13 @@
         </w:trPr>
         <w:tc>
           <w:tcPr>
-            <w:shd w:fill="E8E8E8" w:color="auto" w:val="clear"/>
+            <w:shd w:color="auto" w:fill="E8E8E8" w:val="clear"/>
           </w:tcPr>
           <w:p>
             <w:pPr>
               <w:pStyle w:val="Compact"/>
               <w:jc w:val="left"/>
-              <w:ind w:left="0" w:firstLine="0" w:right="0"/>
+              <w:ind w:right="0" w:firstLine="0" w:left="0"/>
               <w:spacing w:line="240" w:after="40" w:lineRule="auto" w:before="40"/>
             </w:pPr>
             <w:r>
@@ -6233,13 +6233,13 @@
         </w:tc>
         <w:tc>
           <w:tcPr>
-            <w:shd w:fill="E8E8E8" w:color="auto" w:val="clear"/>
+            <w:shd w:color="auto" w:fill="E8E8E8" w:val="clear"/>
           </w:tcPr>
           <w:p>
             <w:pPr>
               <w:pStyle w:val="Compact"/>
               <w:jc w:val="left"/>
-              <w:ind w:left="0" w:firstLine="0" w:right="0"/>
+              <w:ind w:right="0" w:firstLine="0" w:left="0"/>
               <w:spacing w:line="240" w:after="40" w:lineRule="auto" w:before="40"/>
             </w:pPr>
             <w:r>
@@ -6252,13 +6252,13 @@
         </w:tc>
         <w:tc>
           <w:tcPr>
-            <w:shd w:fill="E8E8E8" w:color="auto" w:val="clear"/>
+            <w:shd w:color="auto" w:fill="E8E8E8" w:val="clear"/>
           </w:tcPr>
           <w:p>
             <w:pPr>
               <w:pStyle w:val="Compact"/>
               <w:jc w:val="left"/>
-              <w:ind w:left="0" w:firstLine="0" w:right="0"/>
+              <w:ind w:right="0" w:firstLine="0" w:left="0"/>
               <w:spacing w:line="240" w:after="40" w:lineRule="auto" w:before="40"/>
             </w:pPr>
             <w:r>
@@ -6271,13 +6271,13 @@
         </w:tc>
         <w:tc>
           <w:tcPr>
-            <w:shd w:fill="E8E8E8" w:color="auto" w:val="clear"/>
+            <w:shd w:color="auto" w:fill="E8E8E8" w:val="clear"/>
           </w:tcPr>
           <w:p>
             <w:pPr>
               <w:pStyle w:val="Compact"/>
               <w:jc w:val="left"/>
-              <w:ind w:left="0" w:firstLine="0" w:right="0"/>
+              <w:ind w:right="0" w:firstLine="0" w:left="0"/>
               <w:spacing w:line="240" w:after="40" w:lineRule="auto" w:before="40"/>
             </w:pPr>
             <w:r>
@@ -6290,13 +6290,13 @@
         </w:tc>
         <w:tc>
           <w:tcPr>
-            <w:shd w:fill="E8E8E8" w:color="auto" w:val="clear"/>
+            <w:shd w:color="auto" w:fill="E8E8E8" w:val="clear"/>
           </w:tcPr>
           <w:p>
             <w:pPr>
               <w:pStyle w:val="Compact"/>
               <w:jc w:val="left"/>
-              <w:ind w:left="0" w:firstLine="0" w:right="0"/>
+              <w:ind w:right="0" w:firstLine="0" w:left="0"/>
               <w:spacing w:line="240" w:after="40" w:lineRule="auto" w:before="40"/>
             </w:pPr>
             <w:r>
@@ -6309,13 +6309,13 @@
         </w:tc>
         <w:tc>
           <w:tcPr>
-            <w:shd w:fill="E8E8E8" w:color="auto" w:val="clear"/>
+            <w:shd w:color="auto" w:fill="E8E8E8" w:val="clear"/>
           </w:tcPr>
           <w:p>
             <w:pPr>
               <w:pStyle w:val="Compact"/>
               <w:jc w:val="left"/>
-              <w:ind w:left="0" w:firstLine="0" w:right="0"/>
+              <w:ind w:right="0" w:firstLine="0" w:left="0"/>
               <w:spacing w:line="240" w:after="40" w:lineRule="auto" w:before="40"/>
             </w:pPr>
             <w:r>
@@ -6334,7 +6334,7 @@
             <w:pPr>
               <w:pStyle w:val="Compact"/>
               <w:jc w:val="left"/>
-              <w:ind w:left="0" w:firstLine="0" w:right="0"/>
+              <w:ind w:right="0" w:firstLine="0" w:left="0"/>
               <w:spacing w:line="240" w:after="40" w:lineRule="auto" w:before="40"/>
             </w:pPr>
             <w:r>
@@ -6348,7 +6348,7 @@
             <w:pPr>
               <w:pStyle w:val="Compact"/>
               <w:jc w:val="left"/>
-              <w:ind w:left="0" w:firstLine="0" w:right="0"/>
+              <w:ind w:right="0" w:firstLine="0" w:left="0"/>
               <w:spacing w:line="240" w:after="40" w:lineRule="auto" w:before="40"/>
             </w:pPr>
             <w:r>
@@ -6365,7 +6365,7 @@
             <w:pPr>
               <w:pStyle w:val="Compact"/>
               <w:jc w:val="left"/>
-              <w:ind w:left="0" w:firstLine="0" w:right="0"/>
+              <w:ind w:right="0" w:firstLine="0" w:left="0"/>
               <w:spacing w:line="240" w:after="40" w:lineRule="auto" w:before="40"/>
             </w:pPr>
             <w:r>
@@ -6382,7 +6382,7 @@
             <w:pPr>
               <w:pStyle w:val="Compact"/>
               <w:jc w:val="left"/>
-              <w:ind w:left="0" w:firstLine="0" w:right="0"/>
+              <w:ind w:right="0" w:firstLine="0" w:left="0"/>
               <w:spacing w:line="240" w:after="40" w:lineRule="auto" w:before="40"/>
             </w:pPr>
             <w:r>
@@ -6399,7 +6399,7 @@
             <w:pPr>
               <w:pStyle w:val="Compact"/>
               <w:jc w:val="left"/>
-              <w:ind w:left="0" w:firstLine="0" w:right="0"/>
+              <w:ind w:right="0" w:firstLine="0" w:left="0"/>
               <w:spacing w:line="240" w:after="40" w:lineRule="auto" w:before="40"/>
             </w:pPr>
             <w:r>
@@ -6416,7 +6416,7 @@
             <w:pPr>
               <w:pStyle w:val="Compact"/>
               <w:jc w:val="left"/>
-              <w:ind w:left="0" w:firstLine="0" w:right="0"/>
+              <w:ind w:right="0" w:firstLine="0" w:left="0"/>
               <w:spacing w:line="240" w:after="40" w:lineRule="auto" w:before="40"/>
             </w:pPr>
             <w:r>
@@ -6436,7 +6436,7 @@
             <w:pPr>
               <w:pStyle w:val="Compact"/>
               <w:jc w:val="left"/>
-              <w:ind w:left="0" w:firstLine="0" w:right="0"/>
+              <w:ind w:right="0" w:firstLine="0" w:left="0"/>
               <w:spacing w:line="240" w:after="40" w:lineRule="auto" w:before="40"/>
             </w:pPr>
             <w:r>
@@ -6450,7 +6450,7 @@
             <w:pPr>
               <w:pStyle w:val="Compact"/>
               <w:jc w:val="left"/>
-              <w:ind w:left="0" w:firstLine="0" w:right="0"/>
+              <w:ind w:right="0" w:firstLine="0" w:left="0"/>
               <w:spacing w:line="240" w:after="40" w:lineRule="auto" w:before="40"/>
             </w:pPr>
             <w:r>
@@ -6467,7 +6467,7 @@
             <w:pPr>
               <w:pStyle w:val="Compact"/>
               <w:jc w:val="left"/>
-              <w:ind w:left="0" w:firstLine="0" w:right="0"/>
+              <w:ind w:right="0" w:firstLine="0" w:left="0"/>
               <w:spacing w:line="240" w:after="40" w:lineRule="auto" w:before="40"/>
             </w:pPr>
             <w:r>
@@ -6481,7 +6481,7 @@
             <w:pPr>
               <w:pStyle w:val="Compact"/>
               <w:jc w:val="left"/>
-              <w:ind w:left="0" w:firstLine="0" w:right="0"/>
+              <w:ind w:right="0" w:firstLine="0" w:left="0"/>
               <w:spacing w:line="240" w:after="40" w:lineRule="auto" w:before="40"/>
             </w:pPr>
             <w:r>
@@ -6495,7 +6495,7 @@
             <w:pPr>
               <w:pStyle w:val="Compact"/>
               <w:jc w:val="left"/>
-              <w:ind w:left="0" w:firstLine="0" w:right="0"/>
+              <w:ind w:right="0" w:firstLine="0" w:left="0"/>
               <w:spacing w:line="240" w:after="40" w:lineRule="auto" w:before="40"/>
             </w:pPr>
             <w:r>
@@ -6509,7 +6509,7 @@
             <w:pPr>
               <w:pStyle w:val="Compact"/>
               <w:jc w:val="left"/>
-              <w:ind w:left="0" w:firstLine="0" w:right="0"/>
+              <w:ind w:right="0" w:firstLine="0" w:left="0"/>
               <w:spacing w:line="240" w:after="40" w:lineRule="auto" w:before="40"/>
             </w:pPr>
             <w:r>
@@ -6525,7 +6525,7 @@
             <w:pPr>
               <w:pStyle w:val="Compact"/>
               <w:jc w:val="left"/>
-              <w:ind w:left="0" w:firstLine="0" w:right="0"/>
+              <w:ind w:right="0" w:firstLine="0" w:left="0"/>
               <w:spacing w:line="240" w:after="40" w:lineRule="auto" w:before="40"/>
             </w:pPr>
             <w:r>
@@ -6539,7 +6539,7 @@
             <w:pPr>
               <w:pStyle w:val="Compact"/>
               <w:jc w:val="left"/>
-              <w:ind w:left="0" w:firstLine="0" w:right="0"/>
+              <w:ind w:right="0" w:firstLine="0" w:left="0"/>
               <w:spacing w:line="240" w:after="40" w:lineRule="auto" w:before="40"/>
             </w:pPr>
             <w:r>
@@ -6556,7 +6556,7 @@
             <w:pPr>
               <w:pStyle w:val="Compact"/>
               <w:jc w:val="left"/>
-              <w:ind w:left="0" w:firstLine="0" w:right="0"/>
+              <w:ind w:right="0" w:firstLine="0" w:left="0"/>
               <w:spacing w:line="240" w:after="40" w:lineRule="auto" w:before="40"/>
             </w:pPr>
             <w:r>
@@ -6570,7 +6570,7 @@
             <w:pPr>
               <w:pStyle w:val="Compact"/>
               <w:jc w:val="left"/>
-              <w:ind w:left="0" w:firstLine="0" w:right="0"/>
+              <w:ind w:right="0" w:firstLine="0" w:left="0"/>
               <w:spacing w:line="240" w:after="40" w:lineRule="auto" w:before="40"/>
             </w:pPr>
             <w:r>
@@ -6584,7 +6584,7 @@
             <w:pPr>
               <w:pStyle w:val="Compact"/>
               <w:jc w:val="left"/>
-              <w:ind w:left="0" w:firstLine="0" w:right="0"/>
+              <w:ind w:right="0" w:firstLine="0" w:left="0"/>
               <w:spacing w:line="240" w:after="40" w:lineRule="auto" w:before="40"/>
             </w:pPr>
             <w:r>
@@ -6602,7 +6602,7 @@
             <w:pPr>
               <w:pStyle w:val="Compact"/>
               <w:jc w:val="left"/>
-              <w:ind w:left="0" w:firstLine="0" w:right="0"/>
+              <w:ind w:right="0" w:firstLine="0" w:left="0"/>
               <w:spacing w:line="240" w:after="40" w:lineRule="auto" w:before="40"/>
             </w:pPr>
             <w:r>
@@ -6621,7 +6621,7 @@
       </w:r>
     </w:p>
     <w:bookmarkEnd w:id="67"/>
-    <w:bookmarkStart w:id="68" w:name="examples-4"/>
+    <w:bookmarkStart w:id="68" w:name="SPEC-sec3.6.5"/>
     <w:p>
       <w:pPr>
         <w:pStyle w:val="Heading3"/>
@@ -6693,7 +6693,7 @@
     </w:p>
     <w:bookmarkEnd w:id="68"/>
     <w:bookmarkEnd w:id="69"/>
-    <w:bookmarkStart w:id="77" w:name="spec-view"/>
+    <w:bookmarkStart w:id="77" w:name="SPEC-sec3.7"/>
     <w:p>
       <w:pPr>
         <w:pStyle w:val="Heading2"/>
@@ -6730,7 +6730,7 @@
         <w:t xml:space="preserve">is a dynamic query or generated content block. Views are materialized at processing time and produce content such as tables of contents, lists of figures, abbreviation expansions, and inline math.</w:t>
       </w:r>
     </w:p>
-    <w:bookmarkStart w:id="70" w:name="formal-definition-5"/>
+    <w:bookmarkStart w:id="70" w:name="SPEC-sec3.7.1"/>
     <w:p>
       <w:pPr>
         <w:pStyle w:val="Heading3"/>
@@ -6877,7 +6877,7 @@
       </w:r>
     </w:p>
     <w:bookmarkEnd w:id="70"/>
-    <w:bookmarkStart w:id="74" w:name="grammar-5"/>
+    <w:bookmarkStart w:id="74" w:name="SPEC-sec3.7.2"/>
     <w:p>
       <w:pPr>
         <w:pStyle w:val="Heading3"/>
@@ -6892,12 +6892,12 @@
     </w:p>
     <w:p>
       <w:pPr>
-        <w:spacing w:after="0" w:before="0" w:line="20" w:lineRule="exact"/>
+        <w:spacing w:after="0" w:before="0" w:lineRule="exact" w:line="20"/>
         <w:rPr>
           <w:sz w:val="2"/>
         </w:rPr>
       </w:pPr>
-      <w:bookmarkStart w:name="puml-grammar-spec-view" w:id="24745"/>
+      <w:bookmarkStart w:id="24745" w:name="puml-grammar-spec-view"/>
       <w:bookmarkEnd w:id="24745"/>
     </w:p>
     <w:p>
@@ -6976,7 +6976,7 @@
       </w:r>
     </w:p>
     <w:bookmarkEnd w:id="74"/>
-    <w:bookmarkStart w:id="75" w:name="view-types"/>
+    <w:bookmarkStart w:id="75" w:name="SPEC-sec3.7.3"/>
     <w:p>
       <w:pPr>
         <w:pStyle w:val="Heading3"/>
@@ -7170,7 +7170,7 @@
       </w:r>
     </w:p>
     <w:bookmarkEnd w:id="75"/>
-    <w:bookmarkStart w:id="76" w:name="examples-5"/>
+    <w:bookmarkStart w:id="76" w:name="SPEC-sec3.7.4"/>
     <w:p>
       <w:pPr>
         <w:pStyle w:val="Heading3"/>
@@ -7231,7 +7231,7 @@
     </w:p>
     <w:bookmarkEnd w:id="76"/>
     <w:bookmarkEnd w:id="77"/>
-    <w:bookmarkStart w:id="78" w:name="disambiguation-rules"/>
+    <w:bookmarkStart w:id="78" w:name="SPEC-sec3.8"/>
     <w:p>
       <w:pPr>
         <w:pStyle w:val="Heading2"/>
@@ -7288,7 +7288,34 @@
         <w:pStyle w:val="Compact"/>
       </w:pPr>
       <w:r>
-        <w:t xml:space="preserve">It immediately follows a header (Specification or Spec Object) or another recognized attribute. Each attribute is a separate Markdown blockquote, so distinct attributes must be separated by a blank line.</w:t>
+        <w:t xml:space="preserve">Its first line matches the pattern</w:t>
+      </w:r>
+      <w:r>
+        <w:t xml:space="preserve"> </w:t>
+      </w:r>
+      <w:r>
+        <w:rPr>
+          <w:rStyle w:val="VerbatimChar"/>
+        </w:rPr>
+        <w:t xml:space="preserve">AttrName ":" ...</w:t>
+      </w:r>
+      <w:r>
+        <w:t xml:space="preserve">, where AttrName is a declared attribute name for the enclosing object’s type (own or inherited through the type’s</w:t>
+      </w:r>
+      <w:r>
+        <w:t xml:space="preserve"> </w:t>
+      </w:r>
+      <w:r>
+        <w:rPr>
+          <w:rStyle w:val="VerbatimChar"/>
+        </w:rPr>
+        <w:t xml:space="preserve">extends</w:t>
+      </w:r>
+      <w:r>
+        <w:t xml:space="preserve"> </w:t>
+      </w:r>
+      <w:r>
+        <w:t xml:space="preserve">chain; matching is case-insensitive).</w:t>
       </w:r>
     </w:p>
     <w:p>
@@ -7300,19 +7327,22 @@
         <w:pStyle w:val="Compact"/>
       </w:pPr>
       <w:r>
-        <w:t xml:space="preserve">Its first line matches the pattern</w:t>
-      </w:r>
-      <w:r>
-        <w:t xml:space="preserve"> </w:t>
-      </w:r>
-      <w:r>
-        <w:rPr>
-          <w:rStyle w:val="VerbatimChar"/>
-        </w:rPr>
-        <w:t xml:space="preserve">AttrName ":" ...</w:t>
-      </w:r>
-      <w:r>
-        <w:t xml:space="preserve">, where AttrName is a declared attribute name for the enclosing object’s type.</w:t>
+        <w:t xml:space="preserve">It belongs to the most recently opened Specification or Spec Object header (it need not appear immediately after it). Each attribute is a separate Markdown blockquote, so distinct attributes must be separated by a blank line; every later line or paragraph within the same blockquote — including lines that themselves look like</w:t>
+      </w:r>
+      <w:r>
+        <w:t xml:space="preserve"> </w:t>
+      </w:r>
+      <w:r>
+        <w:rPr>
+          <w:rStyle w:val="VerbatimChar"/>
+        </w:rPr>
+        <w:t xml:space="preserve">key: value</w:t>
+      </w:r>
+      <w:r>
+        <w:t xml:space="preserve"> </w:t>
+      </w:r>
+      <w:r>
+        <w:t xml:space="preserve">— continues the first attribute’s value.</w:t>
       </w:r>
     </w:p>
     <w:p>
@@ -7320,7 +7350,7 @@
         <w:pStyle w:val="FirstParagraph"/>
       </w:pPr>
       <w:r>
-        <w:t xml:space="preserve">If either condition fails, the blockquote is treated as plain body content. For example,</w:t>
+        <w:t xml:space="preserve">If the first condition fails, the blockquote is treated as plain body content. For example,</w:t>
       </w:r>
       <w:r>
         <w:t xml:space="preserve"> </w:t>
@@ -7353,7 +7383,106 @@
         <w:t xml:space="preserve"> </w:t>
       </w:r>
       <w:r>
-        <w:t xml:space="preserve">for the enclosing object type.</w:t>
+        <w:t xml:space="preserve">for the enclosing object type; the compiler emits an</w:t>
+      </w:r>
+      <w:r>
+        <w:t xml:space="preserve"> </w:t>
+      </w:r>
+      <w:r>
+        <w:rPr>
+          <w:rStyle w:val="VerbatimChar"/>
+        </w:rPr>
+        <w:t xml:space="preserve">unknown_attribute</w:t>
+      </w:r>
+      <w:r>
+        <w:t xml:space="preserve"> </w:t>
+      </w:r>
+      <w:r>
+        <w:t xml:space="preserve">warning so mistyped attribute names are visible.</w:t>
+      </w:r>
+    </w:p>
+    <w:p>
+      <w:pPr>
+        <w:pStyle w:val="BodyText"/>
+      </w:pPr>
+      <w:r>
+        <w:rPr>
+          <w:iCs/>
+          <w:i/>
+        </w:rPr>
+        <w:t xml:space="preserve">Specification-level exception.</w:t>
+      </w:r>
+      <w:r>
+        <w:t xml:space="preserve"> </w:t>
+      </w:r>
+      <w:r>
+        <w:t xml:space="preserve">Blockquotes belonging to the H1 header (document metadata such as</w:t>
+      </w:r>
+      <w:r>
+        <w:t xml:space="preserve"> </w:t>
+      </w:r>
+      <w:r>
+        <w:rPr>
+          <w:rStyle w:val="VerbatimChar"/>
+        </w:rPr>
+        <w:t xml:space="preserve">title</w:t>
+      </w:r>
+      <w:r>
+        <w:t xml:space="preserve">,</w:t>
+      </w:r>
+      <w:r>
+        <w:t xml:space="preserve"> </w:t>
+      </w:r>
+      <w:r>
+        <w:rPr>
+          <w:rStyle w:val="VerbatimChar"/>
+        </w:rPr>
+        <w:t xml:space="preserve">author</w:t>
+      </w:r>
+      <w:r>
+        <w:t xml:space="preserve">,</w:t>
+      </w:r>
+      <w:r>
+        <w:t xml:space="preserve"> </w:t>
+      </w:r>
+      <w:r>
+        <w:rPr>
+          <w:rStyle w:val="VerbatimChar"/>
+        </w:rPr>
+        <w:t xml:space="preserve">version</w:t>
+      </w:r>
+      <w:r>
+        <w:t xml:space="preserve">) are permissive: any</w:t>
+      </w:r>
+      <w:r>
+        <w:t xml:space="preserve"> </w:t>
+      </w:r>
+      <w:r>
+        <w:rPr>
+          <w:rStyle w:val="VerbatimChar"/>
+        </w:rPr>
+        <w:t xml:space="preserve">key: value</w:t>
+      </w:r>
+      <w:r>
+        <w:t xml:space="preserve"> </w:t>
+      </w:r>
+      <w:r>
+        <w:t xml:space="preserve">blockquote is stored as specification metadata, with an</w:t>
+      </w:r>
+      <w:r>
+        <w:t xml:space="preserve"> </w:t>
+      </w:r>
+      <w:r>
+        <w:rPr>
+          <w:rStyle w:val="VerbatimChar"/>
+        </w:rPr>
+        <w:t xml:space="preserve">unknown_spec_attribute</w:t>
+      </w:r>
+      <w:r>
+        <w:t xml:space="preserve"> </w:t>
+      </w:r>
+      <w:r>
+        <w:t xml:space="preserve">warning when the key is not declared for the specification’s type.</w:t>
       </w:r>
     </w:p>
     <w:p>
@@ -7568,7 +7697,7 @@
     </w:p>
     <w:bookmarkEnd w:id="78"/>
     <w:bookmarkEnd w:id="79"/>
-    <w:bookmarkStart w:id="85" w:name="type-system"/>
+    <w:bookmarkStart w:id="85" w:name="SPEC-sec4"/>
     <w:p>
       <w:pPr>
         <w:pStyle w:val="Heading1"/>
@@ -7619,7 +7748,7 @@
         <w:t xml:space="preserve">that defines what object types, float types, relation types, view types, specification types, datatypes, and attributes exist. The language syntax is fixed; the model determines what types are valid and how they behave.</w:t>
       </w:r>
     </w:p>
-    <w:bookmarkStart w:id="80" w:name="model-structure"/>
+    <w:bookmarkStart w:id="80" w:name="SPEC-sec4.1"/>
     <w:p>
       <w:pPr>
         <w:pStyle w:val="Heading2"/>
@@ -7773,7 +7902,7 @@
       </w:r>
     </w:p>
     <w:bookmarkEnd w:id="80"/>
-    <w:bookmarkStart w:id="81" w:name="type-definition-schema"/>
+    <w:bookmarkStart w:id="81" w:name="SPEC-sec4.2"/>
     <w:p>
       <w:pPr>
         <w:pStyle w:val="Heading2"/>
@@ -8150,7 +8279,7 @@
       </w:r>
     </w:p>
     <w:bookmarkEnd w:id="81"/>
-    <w:bookmarkStart w:id="82" w:name="type-inheritance"/>
+    <w:bookmarkStart w:id="82" w:name="SPEC-sec4.3"/>
     <w:p>
       <w:pPr>
         <w:pStyle w:val="Heading2"/>
@@ -8347,7 +8476,7 @@
       </w:r>
     </w:p>
     <w:bookmarkEnd w:id="82"/>
-    <w:bookmarkStart w:id="83" w:name="default-model"/>
+    <w:bookmarkStart w:id="83" w:name="SPEC-sec4.4"/>
     <w:p>
       <w:pPr>
         <w:pStyle w:val="Heading2"/>
@@ -8457,7 +8586,7 @@
       </w:r>
     </w:p>
     <w:bookmarkEnd w:id="83"/>
-    <w:bookmarkStart w:id="84" w:name="domain-models"/>
+    <w:bookmarkStart w:id="84" w:name="SPEC-sec4.5"/>
     <w:p>
       <w:pPr>
         <w:pStyle w:val="Heading2"/>
@@ -8590,7 +8719,7 @@
     </w:p>
     <w:bookmarkEnd w:id="84"/>
     <w:bookmarkEnd w:id="85"/>
-    <w:bookmarkStart w:id="89" w:name="datatypes-1"/>
+    <w:bookmarkStart w:id="89" w:name="SPEC-sec5"/>
     <w:p>
       <w:pPr>
         <w:pStyle w:val="Heading1"/>
@@ -8603,7 +8732,7 @@
         <w:t xml:space="preserve">Datatypes</w:t>
       </w:r>
     </w:p>
-    <w:bookmarkStart w:id="86" w:name="primitive-datatypes"/>
+    <w:bookmarkStart w:id="86" w:name="SPEC-sec5.1"/>
     <w:p>
       <w:pPr>
         <w:pStyle w:val="Heading2"/>
@@ -8626,12 +8755,12 @@
     </w:p>
     <w:p>
       <w:pPr>
-        <w:spacing w:after="0" w:before="0" w:line="20" w:lineRule="exact"/>
+        <w:spacing w:after="0" w:before="0" w:lineRule="exact" w:line="20"/>
         <w:rPr>
           <w:sz w:val="2"/>
         </w:rPr>
       </w:pPr>
-      <w:bookmarkStart w:name="csv-primitive-datatypes" w:id="46083"/>
+      <w:bookmarkStart w:id="46083" w:name="csv-primitive-datatypes"/>
       <w:bookmarkEnd w:id="46083"/>
     </w:p>
     <w:p>
@@ -8693,13 +8822,13 @@
         </w:trPr>
         <w:tc>
           <w:tcPr>
-            <w:shd w:fill="E8E8E8" w:color="auto" w:val="clear"/>
+            <w:shd w:color="auto" w:fill="E8E8E8" w:val="clear"/>
           </w:tcPr>
           <w:p>
             <w:pPr>
               <w:pStyle w:val="Compact"/>
               <w:jc w:val="left"/>
-              <w:ind w:left="0" w:firstLine="0" w:right="0"/>
+              <w:ind w:right="0" w:firstLine="0" w:left="0"/>
               <w:spacing w:line="240" w:after="40" w:lineRule="auto" w:before="40"/>
             </w:pPr>
             <w:r>
@@ -8712,13 +8841,13 @@
         </w:tc>
         <w:tc>
           <w:tcPr>
-            <w:shd w:fill="E8E8E8" w:color="auto" w:val="clear"/>
+            <w:shd w:color="auto" w:fill="E8E8E8" w:val="clear"/>
           </w:tcPr>
           <w:p>
             <w:pPr>
               <w:pStyle w:val="Compact"/>
               <w:jc w:val="left"/>
-              <w:ind w:left="0" w:firstLine="0" w:right="0"/>
+              <w:ind w:right="0" w:firstLine="0" w:left="0"/>
               <w:spacing w:line="240" w:after="40" w:lineRule="auto" w:before="40"/>
             </w:pPr>
             <w:r>
@@ -8731,13 +8860,13 @@
         </w:tc>
         <w:tc>
           <w:tcPr>
-            <w:shd w:fill="E8E8E8" w:color="auto" w:val="clear"/>
+            <w:shd w:color="auto" w:fill="E8E8E8" w:val="clear"/>
           </w:tcPr>
           <w:p>
             <w:pPr>
               <w:pStyle w:val="Compact"/>
               <w:jc w:val="left"/>
-              <w:ind w:left="0" w:firstLine="0" w:right="0"/>
+              <w:ind w:right="0" w:firstLine="0" w:left="0"/>
               <w:spacing w:line="240" w:after="40" w:lineRule="auto" w:before="40"/>
             </w:pPr>
             <w:r>
@@ -8756,7 +8885,7 @@
             <w:pPr>
               <w:pStyle w:val="Compact"/>
               <w:jc w:val="left"/>
-              <w:ind w:left="0" w:firstLine="0" w:right="0"/>
+              <w:ind w:right="0" w:firstLine="0" w:left="0"/>
               <w:spacing w:line="240" w:after="40" w:lineRule="auto" w:before="40"/>
             </w:pPr>
             <w:r>
@@ -8770,7 +8899,7 @@
             <w:pPr>
               <w:pStyle w:val="Compact"/>
               <w:jc w:val="left"/>
-              <w:ind w:left="0" w:firstLine="0" w:right="0"/>
+              <w:ind w:right="0" w:firstLine="0" w:left="0"/>
               <w:spacing w:line="240" w:after="40" w:lineRule="auto" w:before="40"/>
             </w:pPr>
             <w:r>
@@ -8784,7 +8913,7 @@
             <w:pPr>
               <w:pStyle w:val="Compact"/>
               <w:jc w:val="left"/>
-              <w:ind w:left="0" w:firstLine="0" w:right="0"/>
+              <w:ind w:right="0" w:firstLine="0" w:left="0"/>
               <w:spacing w:line="240" w:after="40" w:lineRule="auto" w:before="40"/>
             </w:pPr>
             <w:r>
@@ -8800,7 +8929,7 @@
             <w:pPr>
               <w:pStyle w:val="Compact"/>
               <w:jc w:val="left"/>
-              <w:ind w:left="0" w:firstLine="0" w:right="0"/>
+              <w:ind w:right="0" w:firstLine="0" w:left="0"/>
               <w:spacing w:line="240" w:after="40" w:lineRule="auto" w:before="40"/>
             </w:pPr>
             <w:r>
@@ -8814,7 +8943,7 @@
             <w:pPr>
               <w:pStyle w:val="Compact"/>
               <w:jc w:val="left"/>
-              <w:ind w:left="0" w:firstLine="0" w:right="0"/>
+              <w:ind w:right="0" w:firstLine="0" w:left="0"/>
               <w:spacing w:line="240" w:after="40" w:lineRule="auto" w:before="40"/>
             </w:pPr>
             <w:r>
@@ -8828,7 +8957,7 @@
             <w:pPr>
               <w:pStyle w:val="Compact"/>
               <w:jc w:val="left"/>
-              <w:ind w:left="0" w:firstLine="0" w:right="0"/>
+              <w:ind w:right="0" w:firstLine="0" w:left="0"/>
               <w:spacing w:line="240" w:after="40" w:lineRule="auto" w:before="40"/>
             </w:pPr>
             <w:r>
@@ -8844,7 +8973,7 @@
             <w:pPr>
               <w:pStyle w:val="Compact"/>
               <w:jc w:val="left"/>
-              <w:ind w:left="0" w:firstLine="0" w:right="0"/>
+              <w:ind w:right="0" w:firstLine="0" w:left="0"/>
               <w:spacing w:line="240" w:after="40" w:lineRule="auto" w:before="40"/>
             </w:pPr>
             <w:r>
@@ -8858,7 +8987,7 @@
             <w:pPr>
               <w:pStyle w:val="Compact"/>
               <w:jc w:val="left"/>
-              <w:ind w:left="0" w:firstLine="0" w:right="0"/>
+              <w:ind w:right="0" w:firstLine="0" w:left="0"/>
               <w:spacing w:line="240" w:after="40" w:lineRule="auto" w:before="40"/>
             </w:pPr>
             <w:r>
@@ -8872,7 +9001,7 @@
             <w:pPr>
               <w:pStyle w:val="Compact"/>
               <w:jc w:val="left"/>
-              <w:ind w:left="0" w:firstLine="0" w:right="0"/>
+              <w:ind w:right="0" w:firstLine="0" w:left="0"/>
               <w:spacing w:line="240" w:after="40" w:lineRule="auto" w:before="40"/>
             </w:pPr>
             <w:r>
@@ -8888,7 +9017,7 @@
             <w:pPr>
               <w:pStyle w:val="Compact"/>
               <w:jc w:val="left"/>
-              <w:ind w:left="0" w:firstLine="0" w:right="0"/>
+              <w:ind w:right="0" w:firstLine="0" w:left="0"/>
               <w:spacing w:line="240" w:after="40" w:lineRule="auto" w:before="40"/>
             </w:pPr>
             <w:r>
@@ -8902,7 +9031,7 @@
             <w:pPr>
               <w:pStyle w:val="Compact"/>
               <w:jc w:val="left"/>
-              <w:ind w:left="0" w:firstLine="0" w:right="0"/>
+              <w:ind w:right="0" w:firstLine="0" w:left="0"/>
               <w:spacing w:line="240" w:after="40" w:lineRule="auto" w:before="40"/>
             </w:pPr>
             <w:r>
@@ -8916,7 +9045,7 @@
             <w:pPr>
               <w:pStyle w:val="Compact"/>
               <w:jc w:val="left"/>
-              <w:ind w:left="0" w:firstLine="0" w:right="0"/>
+              <w:ind w:right="0" w:firstLine="0" w:left="0"/>
               <w:spacing w:line="240" w:after="40" w:lineRule="auto" w:before="40"/>
             </w:pPr>
             <w:r>
@@ -8932,7 +9061,7 @@
             <w:pPr>
               <w:pStyle w:val="Compact"/>
               <w:jc w:val="left"/>
-              <w:ind w:left="0" w:firstLine="0" w:right="0"/>
+              <w:ind w:right="0" w:firstLine="0" w:left="0"/>
               <w:spacing w:line="240" w:after="40" w:lineRule="auto" w:before="40"/>
             </w:pPr>
             <w:r>
@@ -8946,7 +9075,7 @@
             <w:pPr>
               <w:pStyle w:val="Compact"/>
               <w:jc w:val="left"/>
-              <w:ind w:left="0" w:firstLine="0" w:right="0"/>
+              <w:ind w:right="0" w:firstLine="0" w:left="0"/>
               <w:spacing w:line="240" w:after="40" w:lineRule="auto" w:before="40"/>
             </w:pPr>
             <w:r>
@@ -8960,7 +9089,7 @@
             <w:pPr>
               <w:pStyle w:val="Compact"/>
               <w:jc w:val="left"/>
-              <w:ind w:left="0" w:firstLine="0" w:right="0"/>
+              <w:ind w:right="0" w:firstLine="0" w:left="0"/>
               <w:spacing w:line="240" w:after="40" w:lineRule="auto" w:before="40"/>
             </w:pPr>
             <w:r>
@@ -8976,7 +9105,7 @@
             <w:pPr>
               <w:pStyle w:val="Compact"/>
               <w:jc w:val="left"/>
-              <w:ind w:left="0" w:firstLine="0" w:right="0"/>
+              <w:ind w:right="0" w:firstLine="0" w:left="0"/>
               <w:spacing w:line="240" w:after="40" w:lineRule="auto" w:before="40"/>
             </w:pPr>
             <w:r>
@@ -8990,7 +9119,7 @@
             <w:pPr>
               <w:pStyle w:val="Compact"/>
               <w:jc w:val="left"/>
-              <w:ind w:left="0" w:firstLine="0" w:right="0"/>
+              <w:ind w:right="0" w:firstLine="0" w:left="0"/>
               <w:spacing w:line="240" w:after="40" w:lineRule="auto" w:before="40"/>
             </w:pPr>
             <w:r>
@@ -9004,7 +9133,7 @@
             <w:pPr>
               <w:pStyle w:val="Compact"/>
               <w:jc w:val="left"/>
-              <w:ind w:left="0" w:firstLine="0" w:right="0"/>
+              <w:ind w:right="0" w:firstLine="0" w:left="0"/>
               <w:spacing w:line="240" w:after="40" w:lineRule="auto" w:before="40"/>
             </w:pPr>
             <w:r>
@@ -9020,7 +9149,7 @@
             <w:pPr>
               <w:pStyle w:val="Compact"/>
               <w:jc w:val="left"/>
-              <w:ind w:left="0" w:firstLine="0" w:right="0"/>
+              <w:ind w:right="0" w:firstLine="0" w:left="0"/>
               <w:spacing w:line="240" w:after="40" w:lineRule="auto" w:before="40"/>
             </w:pPr>
             <w:r>
@@ -9034,7 +9163,7 @@
             <w:pPr>
               <w:pStyle w:val="Compact"/>
               <w:jc w:val="left"/>
-              <w:ind w:left="0" w:firstLine="0" w:right="0"/>
+              <w:ind w:right="0" w:firstLine="0" w:left="0"/>
               <w:spacing w:line="240" w:after="40" w:lineRule="auto" w:before="40"/>
             </w:pPr>
             <w:r>
@@ -9048,7 +9177,7 @@
             <w:pPr>
               <w:pStyle w:val="Compact"/>
               <w:jc w:val="left"/>
-              <w:ind w:left="0" w:firstLine="0" w:right="0"/>
+              <w:ind w:right="0" w:firstLine="0" w:left="0"/>
               <w:spacing w:line="240" w:after="40" w:lineRule="auto" w:before="40"/>
             </w:pPr>
             <w:r>
@@ -9059,7 +9188,7 @@
       </w:tr>
     </w:tbl>
     <w:bookmarkEnd w:id="86"/>
-    <w:bookmarkStart w:id="87" w:name="enum-definitions"/>
+    <w:bookmarkStart w:id="87" w:name="SPEC-sec5.2"/>
     <w:p>
       <w:pPr>
         <w:pStyle w:val="Heading2"/>
@@ -9149,7 +9278,7 @@
       </w:r>
     </w:p>
     <w:bookmarkEnd w:id="87"/>
-    <w:bookmarkStart w:id="88" w:name="attribute-type-declarations"/>
+    <w:bookmarkStart w:id="88" w:name="SPEC-sec5.3"/>
     <w:p>
       <w:pPr>
         <w:pStyle w:val="Heading2"/>
@@ -9312,7 +9441,7 @@
     </w:p>
     <w:bookmarkEnd w:id="88"/>
     <w:bookmarkEnd w:id="89"/>
-    <w:bookmarkStart w:id="90" w:name="summary"/>
+    <w:bookmarkStart w:id="90" w:name="SPEC-sec6"/>
     <w:p>
       <w:pPr>
         <w:pStyle w:val="Heading1"/>
@@ -9585,7 +9714,7 @@
 </file>
 
 <file path=word/footer1.xml><?xml version="1.0" encoding="utf-8"?>
-<w:ftr xmlns:r="http://schemas.openxmlformats.org/officeDocument/2006/relationships" xmlns:w="http://schemas.openxmlformats.org/wordprocessingml/2006/main">
+<w:ftr xmlns:w="http://schemas.openxmlformats.org/wordprocessingml/2006/main" xmlns:r="http://schemas.openxmlformats.org/officeDocument/2006/relationships">
   <w:tbl>
     <w:tblPr>
       <w:tblW w:w="5000" w:type="pct"/>
@@ -9711,7 +9840,7 @@
 </file>
 
 <file path=word/header1.xml><?xml version="1.0" encoding="utf-8"?>
-<w:hdr xmlns:r="http://schemas.openxmlformats.org/officeDocument/2006/relationships" xmlns:w="http://schemas.openxmlformats.org/wordprocessingml/2006/main">
+<w:hdr xmlns:w="http://schemas.openxmlformats.org/wordprocessingml/2006/main" xmlns:r="http://schemas.openxmlformats.org/officeDocument/2006/relationships">
   <w:p>
     <w:pPr>
       <w:pStyle w:val="Header"/>
@@ -9721,7 +9850,7 @@
 </file>
 
 <file path=word/header2.xml><?xml version="1.0" encoding="utf-8"?>
-<w:hdr xmlns:r="http://schemas.openxmlformats.org/officeDocument/2006/relationships" xmlns:w="http://schemas.openxmlformats.org/wordprocessingml/2006/main">
+<w:hdr xmlns:w="http://schemas.openxmlformats.org/wordprocessingml/2006/main" xmlns:r="http://schemas.openxmlformats.org/officeDocument/2006/relationships">
   <w:p>
     <w:pPr>
       <w:pStyle w:val="Header"/>
@@ -10993,7 +11122,7 @@
     <w:basedOn w:val="VerbatimChar"/>
     <w:rPr/>
   </w:style>
-  <w:style w:styleId="SpecObjectHeader" w:type="paragraph" w:customStyle="1">
+  <w:style w:type="paragraph" w:styleId="SpecObjectHeader" w:customStyle="1">
     <w:name w:val="Spec Object Header"/>
     <w:basedOn w:val="Normal"/>
     <w:next w:val="FirstParagraph"/>

</xml_diff>

<commit_message>
Deploy documentation from v0.5
</commit_message>
<xml_diff>
--- a/commonspec/downloads/commonspec.docx
+++ b/commonspec/downloads/commonspec.docx
@@ -1688,7 +1688,7 @@
     </w:p>
     <w:p>
       <w:pPr>
-        <w:spacing w:lineRule="exact" w:before="0" w:after="0" w:line="20"/>
+        <w:spacing w:line="20" w:before="0" w:after="0" w:lineRule="exact"/>
         <w:rPr>
           <w:sz w:val="2"/>
         </w:rPr>
@@ -1731,7 +1731,7 @@
       <w:r>
         <w:drawing>
           <wp:inline>
-            <wp:extent cx="5334000" cy="1517009"/>
+            <wp:extent cx="5334000" cy="1407367"/>
             <wp:effectExtent b="0" l="0" r="0" t="0"/>
             <wp:docPr descr="" title="" id="28" name="Picture"/>
             <a:graphic>
@@ -1752,7 +1752,7 @@
                   <pic:spPr bwMode="auto">
                     <a:xfrm>
                       <a:off x="0" y="0"/>
-                      <a:ext cx="5334000" cy="1517009"/>
+                      <a:ext cx="5334000" cy="1407367"/>
                     </a:xfrm>
                     <a:prstGeom prst="rect">
                       <a:avLst/>
@@ -2396,7 +2396,7 @@
     </w:p>
     <w:p>
       <w:pPr>
-        <w:spacing w:lineRule="exact" w:before="0" w:after="0" w:line="20"/>
+        <w:spacing w:line="20" w:before="0" w:after="0" w:lineRule="exact"/>
         <w:rPr>
           <w:sz w:val="2"/>
         </w:rPr>
@@ -2439,7 +2439,7 @@
       <w:r>
         <w:drawing>
           <wp:inline>
-            <wp:extent cx="5334000" cy="2747375"/>
+            <wp:extent cx="5334000" cy="2597000"/>
             <wp:effectExtent b="0" l="0" r="0" t="0"/>
             <wp:docPr descr="" title="" id="35" name="Picture"/>
             <a:graphic>
@@ -2460,7 +2460,7 @@
                   <pic:spPr bwMode="auto">
                     <a:xfrm>
                       <a:off x="0" y="0"/>
-                      <a:ext cx="5334000" cy="2747375"/>
+                      <a:ext cx="5334000" cy="2597000"/>
                     </a:xfrm>
                     <a:prstGeom prst="rect">
                       <a:avLst/>
@@ -3370,7 +3370,7 @@
     </w:p>
     <w:p>
       <w:pPr>
-        <w:spacing w:lineRule="exact" w:before="0" w:after="0" w:line="20"/>
+        <w:spacing w:line="20" w:before="0" w:after="0" w:lineRule="exact"/>
         <w:rPr>
           <w:sz w:val="2"/>
         </w:rPr>
@@ -3413,7 +3413,7 @@
       <w:r>
         <w:drawing>
           <wp:inline>
-            <wp:extent cx="5334000" cy="829415"/>
+            <wp:extent cx="5334000" cy="856247"/>
             <wp:effectExtent b="0" l="0" r="0" t="0"/>
             <wp:docPr descr="" title="" id="45" name="Picture"/>
             <a:graphic>
@@ -3434,7 +3434,7 @@
                   <pic:spPr bwMode="auto">
                     <a:xfrm>
                       <a:off x="0" y="0"/>
-                      <a:ext cx="5334000" cy="829415"/>
+                      <a:ext cx="5334000" cy="856247"/>
                     </a:xfrm>
                     <a:prstGeom prst="rect">
                       <a:avLst/>
@@ -4312,7 +4312,7 @@
     </w:p>
     <w:p>
       <w:pPr>
-        <w:spacing w:lineRule="exact" w:before="0" w:after="0" w:line="20"/>
+        <w:spacing w:line="20" w:before="0" w:after="0" w:lineRule="exact"/>
         <w:rPr>
           <w:sz w:val="2"/>
         </w:rPr>
@@ -4355,7 +4355,7 @@
       <w:r>
         <w:drawing>
           <wp:inline>
-            <wp:extent cx="5334000" cy="1538491"/>
+            <wp:extent cx="5334000" cy="1554676"/>
             <wp:effectExtent b="0" l="0" r="0" t="0"/>
             <wp:docPr descr="" title="" id="53" name="Picture"/>
             <a:graphic>
@@ -4376,7 +4376,7 @@
                   <pic:spPr bwMode="auto">
                     <a:xfrm>
                       <a:off x="0" y="0"/>
-                      <a:ext cx="5334000" cy="1538491"/>
+                      <a:ext cx="5334000" cy="1554676"/>
                     </a:xfrm>
                     <a:prstGeom prst="rect">
                       <a:avLst/>
@@ -5458,7 +5458,7 @@
     </w:p>
     <w:p>
       <w:pPr>
-        <w:spacing w:lineRule="exact" w:before="0" w:after="0" w:line="20"/>
+        <w:spacing w:line="20" w:before="0" w:after="0" w:lineRule="exact"/>
         <w:rPr>
           <w:sz w:val="2"/>
         </w:rPr>
@@ -5501,7 +5501,7 @@
       <w:r>
         <w:drawing>
           <wp:inline>
-            <wp:extent cx="4851400" cy="1689100"/>
+            <wp:extent cx="4737100" cy="1676400"/>
             <wp:effectExtent b="0" l="0" r="0" t="0"/>
             <wp:docPr descr="" title="" id="63" name="Picture"/>
             <a:graphic>
@@ -5522,7 +5522,7 @@
                   <pic:spPr bwMode="auto">
                     <a:xfrm>
                       <a:off x="0" y="0"/>
-                      <a:ext cx="4851400" cy="1689100"/>
+                      <a:ext cx="4737100" cy="1676400"/>
                     </a:xfrm>
                     <a:prstGeom prst="rect">
                       <a:avLst/>
@@ -6232,12 +6232,12 @@
         <w:tblLook w:firstRow="1" w:lastRow="0" w:firstColumn="0" w:lastColumn="0" w:noHBand="0" w:noVBand="0" w:val="0020"/>
         <w:jc w:val="start"/>
         <w:tblBorders>
-          <w:top w:val="single" w:color="000000" w:sz="6" w:space="0"/>
-          <w:left w:val="single" w:color="000000" w:sz="6" w:space="0"/>
-          <w:bottom w:val="single" w:color="000000" w:sz="6" w:space="0"/>
-          <w:right w:val="single" w:color="000000" w:sz="6" w:space="0"/>
-          <w:insideH w:val="single" w:color="000000" w:sz="6" w:space="0"/>
-          <w:insideV w:val="single" w:color="000000" w:sz="6" w:space="0"/>
+          <w:top w:sz="6" w:val="single" w:color="000000" w:space="0"/>
+          <w:left w:sz="6" w:val="single" w:color="000000" w:space="0"/>
+          <w:bottom w:sz="6" w:val="single" w:color="000000" w:space="0"/>
+          <w:right w:sz="6" w:val="single" w:color="000000" w:space="0"/>
+          <w:insideH w:sz="6" w:val="single" w:color="000000" w:space="0"/>
+          <w:insideV w:sz="6" w:val="single" w:color="000000" w:space="0"/>
         </w:tblBorders>
         <w:tblCellMar>
           <w:top w:w="57" w:type="dxa"/>
@@ -6260,14 +6260,14 @@
         </w:trPr>
         <w:tc>
           <w:tcPr>
-            <w:shd w:val="clear" w:color="auto" w:fill="E8E8E8"/>
+            <w:shd w:fill="E8E8E8" w:val="clear" w:color="auto"/>
           </w:tcPr>
           <w:p>
             <w:pPr>
               <w:pStyle w:val="Compact"/>
               <w:jc w:val="left"/>
-              <w:ind w:left="0" w:firstLine="0" w:right="0"/>
-              <w:spacing w:lineRule="auto" w:line="240" w:after="40" w:before="40"/>
+              <w:ind w:right="0" w:firstLine="0" w:left="0"/>
+              <w:spacing w:lineRule="auto" w:before="40" w:line="240" w:after="40"/>
             </w:pPr>
             <w:r>
               <w:rPr>
@@ -6279,14 +6279,14 @@
         </w:tc>
         <w:tc>
           <w:tcPr>
-            <w:shd w:val="clear" w:color="auto" w:fill="E8E8E8"/>
+            <w:shd w:fill="E8E8E8" w:val="clear" w:color="auto"/>
           </w:tcPr>
           <w:p>
             <w:pPr>
               <w:pStyle w:val="Compact"/>
               <w:jc w:val="left"/>
-              <w:ind w:left="0" w:firstLine="0" w:right="0"/>
-              <w:spacing w:lineRule="auto" w:line="240" w:after="40" w:before="40"/>
+              <w:ind w:right="0" w:firstLine="0" w:left="0"/>
+              <w:spacing w:lineRule="auto" w:before="40" w:line="240" w:after="40"/>
             </w:pPr>
             <w:r>
               <w:rPr>
@@ -6298,14 +6298,14 @@
         </w:tc>
         <w:tc>
           <w:tcPr>
-            <w:shd w:val="clear" w:color="auto" w:fill="E8E8E8"/>
+            <w:shd w:fill="E8E8E8" w:val="clear" w:color="auto"/>
           </w:tcPr>
           <w:p>
             <w:pPr>
               <w:pStyle w:val="Compact"/>
               <w:jc w:val="left"/>
-              <w:ind w:left="0" w:firstLine="0" w:right="0"/>
-              <w:spacing w:lineRule="auto" w:line="240" w:after="40" w:before="40"/>
+              <w:ind w:right="0" w:firstLine="0" w:left="0"/>
+              <w:spacing w:lineRule="auto" w:before="40" w:line="240" w:after="40"/>
             </w:pPr>
             <w:r>
               <w:rPr>
@@ -6317,14 +6317,14 @@
         </w:tc>
         <w:tc>
           <w:tcPr>
-            <w:shd w:val="clear" w:color="auto" w:fill="E8E8E8"/>
+            <w:shd w:fill="E8E8E8" w:val="clear" w:color="auto"/>
           </w:tcPr>
           <w:p>
             <w:pPr>
               <w:pStyle w:val="Compact"/>
               <w:jc w:val="left"/>
-              <w:ind w:left="0" w:firstLine="0" w:right="0"/>
-              <w:spacing w:lineRule="auto" w:line="240" w:after="40" w:before="40"/>
+              <w:ind w:right="0" w:firstLine="0" w:left="0"/>
+              <w:spacing w:lineRule="auto" w:before="40" w:line="240" w:after="40"/>
             </w:pPr>
             <w:r>
               <w:rPr>
@@ -6336,14 +6336,14 @@
         </w:tc>
         <w:tc>
           <w:tcPr>
-            <w:shd w:val="clear" w:color="auto" w:fill="E8E8E8"/>
+            <w:shd w:fill="E8E8E8" w:val="clear" w:color="auto"/>
           </w:tcPr>
           <w:p>
             <w:pPr>
               <w:pStyle w:val="Compact"/>
               <w:jc w:val="left"/>
-              <w:ind w:left="0" w:firstLine="0" w:right="0"/>
-              <w:spacing w:lineRule="auto" w:line="240" w:after="40" w:before="40"/>
+              <w:ind w:right="0" w:firstLine="0" w:left="0"/>
+              <w:spacing w:lineRule="auto" w:before="40" w:line="240" w:after="40"/>
             </w:pPr>
             <w:r>
               <w:rPr>
@@ -6355,14 +6355,14 @@
         </w:tc>
         <w:tc>
           <w:tcPr>
-            <w:shd w:val="clear" w:color="auto" w:fill="E8E8E8"/>
+            <w:shd w:fill="E8E8E8" w:val="clear" w:color="auto"/>
           </w:tcPr>
           <w:p>
             <w:pPr>
               <w:pStyle w:val="Compact"/>
               <w:jc w:val="left"/>
-              <w:ind w:left="0" w:firstLine="0" w:right="0"/>
-              <w:spacing w:lineRule="auto" w:line="240" w:after="40" w:before="40"/>
+              <w:ind w:right="0" w:firstLine="0" w:left="0"/>
+              <w:spacing w:lineRule="auto" w:before="40" w:line="240" w:after="40"/>
             </w:pPr>
             <w:r>
               <w:rPr>
@@ -6380,8 +6380,8 @@
             <w:pPr>
               <w:pStyle w:val="Compact"/>
               <w:jc w:val="left"/>
-              <w:ind w:left="0" w:firstLine="0" w:right="0"/>
-              <w:spacing w:lineRule="auto" w:line="240" w:after="40" w:before="40"/>
+              <w:ind w:right="0" w:firstLine="0" w:left="0"/>
+              <w:spacing w:lineRule="auto" w:before="40" w:line="240" w:after="40"/>
             </w:pPr>
             <w:r>
               <w:t xml:space="preserve">VERIFIES</w:t>
@@ -6394,8 +6394,8 @@
             <w:pPr>
               <w:pStyle w:val="Compact"/>
               <w:jc w:val="left"/>
-              <w:ind w:left="0" w:firstLine="0" w:right="0"/>
-              <w:spacing w:lineRule="auto" w:line="240" w:after="40" w:before="40"/>
+              <w:ind w:right="0" w:firstLine="0" w:left="0"/>
+              <w:spacing w:lineRule="auto" w:before="40" w:line="240" w:after="40"/>
             </w:pPr>
             <w:r>
               <w:rPr>
@@ -6411,8 +6411,8 @@
             <w:pPr>
               <w:pStyle w:val="Compact"/>
               <w:jc w:val="left"/>
-              <w:ind w:left="0" w:firstLine="0" w:right="0"/>
-              <w:spacing w:lineRule="auto" w:line="240" w:after="40" w:before="40"/>
+              <w:ind w:right="0" w:firstLine="0" w:left="0"/>
+              <w:spacing w:lineRule="auto" w:before="40" w:line="240" w:after="40"/>
             </w:pPr>
             <w:r>
               <w:rPr>
@@ -6428,8 +6428,8 @@
             <w:pPr>
               <w:pStyle w:val="Compact"/>
               <w:jc w:val="left"/>
-              <w:ind w:left="0" w:firstLine="0" w:right="0"/>
-              <w:spacing w:lineRule="auto" w:line="240" w:after="40" w:before="40"/>
+              <w:ind w:right="0" w:firstLine="0" w:left="0"/>
+              <w:spacing w:lineRule="auto" w:before="40" w:line="240" w:after="40"/>
             </w:pPr>
             <w:r>
               <w:rPr>
@@ -6445,8 +6445,8 @@
             <w:pPr>
               <w:pStyle w:val="Compact"/>
               <w:jc w:val="left"/>
-              <w:ind w:left="0" w:firstLine="0" w:right="0"/>
-              <w:spacing w:lineRule="auto" w:line="240" w:after="40" w:before="40"/>
+              <w:ind w:right="0" w:firstLine="0" w:left="0"/>
+              <w:spacing w:lineRule="auto" w:before="40" w:line="240" w:after="40"/>
             </w:pPr>
             <w:r>
               <w:rPr>
@@ -6462,8 +6462,8 @@
             <w:pPr>
               <w:pStyle w:val="Compact"/>
               <w:jc w:val="left"/>
-              <w:ind w:left="0" w:firstLine="0" w:right="0"/>
-              <w:spacing w:lineRule="auto" w:line="240" w:after="40" w:before="40"/>
+              <w:ind w:right="0" w:firstLine="0" w:left="0"/>
+              <w:spacing w:lineRule="auto" w:before="40" w:line="240" w:after="40"/>
             </w:pPr>
             <w:r>
               <w:rPr>
@@ -6482,8 +6482,8 @@
             <w:pPr>
               <w:pStyle w:val="Compact"/>
               <w:jc w:val="left"/>
-              <w:ind w:left="0" w:firstLine="0" w:right="0"/>
-              <w:spacing w:lineRule="auto" w:line="240" w:after="40" w:before="40"/>
+              <w:ind w:right="0" w:firstLine="0" w:left="0"/>
+              <w:spacing w:lineRule="auto" w:before="40" w:line="240" w:after="40"/>
             </w:pPr>
             <w:r>
               <w:t xml:space="preserve">TRACES_TO</w:t>
@@ -6496,8 +6496,8 @@
             <w:pPr>
               <w:pStyle w:val="Compact"/>
               <w:jc w:val="left"/>
-              <w:ind w:left="0" w:firstLine="0" w:right="0"/>
-              <w:spacing w:lineRule="auto" w:line="240" w:after="40" w:before="40"/>
+              <w:ind w:right="0" w:firstLine="0" w:left="0"/>
+              <w:spacing w:lineRule="auto" w:before="40" w:line="240" w:after="40"/>
             </w:pPr>
             <w:r>
               <w:rPr>
@@ -6513,8 +6513,8 @@
             <w:pPr>
               <w:pStyle w:val="Compact"/>
               <w:jc w:val="left"/>
-              <w:ind w:left="0" w:firstLine="0" w:right="0"/>
-              <w:spacing w:lineRule="auto" w:line="240" w:after="40" w:before="40"/>
+              <w:ind w:right="0" w:firstLine="0" w:left="0"/>
+              <w:spacing w:lineRule="auto" w:before="40" w:line="240" w:after="40"/>
             </w:pPr>
             <w:r>
               <w:t xml:space="preserve">—</w:t>
@@ -6527,8 +6527,8 @@
             <w:pPr>
               <w:pStyle w:val="Compact"/>
               <w:jc w:val="left"/>
-              <w:ind w:left="0" w:firstLine="0" w:right="0"/>
-              <w:spacing w:lineRule="auto" w:line="240" w:after="40" w:before="40"/>
+              <w:ind w:right="0" w:firstLine="0" w:left="0"/>
+              <w:spacing w:lineRule="auto" w:before="40" w:line="240" w:after="40"/>
             </w:pPr>
             <w:r>
               <w:t xml:space="preserve">—</w:t>
@@ -6541,8 +6541,8 @@
             <w:pPr>
               <w:pStyle w:val="Compact"/>
               <w:jc w:val="left"/>
-              <w:ind w:left="0" w:firstLine="0" w:right="0"/>
-              <w:spacing w:lineRule="auto" w:line="240" w:after="40" w:before="40"/>
+              <w:ind w:right="0" w:firstLine="0" w:left="0"/>
+              <w:spacing w:lineRule="auto" w:before="40" w:line="240" w:after="40"/>
             </w:pPr>
             <w:r>
               <w:t xml:space="preserve">—</w:t>
@@ -6555,8 +6555,8 @@
             <w:pPr>
               <w:pStyle w:val="Compact"/>
               <w:jc w:val="left"/>
-              <w:ind w:left="0" w:firstLine="0" w:right="0"/>
-              <w:spacing w:lineRule="auto" w:line="240" w:after="40" w:before="40"/>
+              <w:ind w:right="0" w:firstLine="0" w:left="0"/>
+              <w:spacing w:lineRule="auto" w:before="40" w:line="240" w:after="40"/>
             </w:pPr>
             <w:r>
               <w:t xml:space="preserve">1</w:t>
@@ -6571,8 +6571,8 @@
             <w:pPr>
               <w:pStyle w:val="Compact"/>
               <w:jc w:val="left"/>
-              <w:ind w:left="0" w:firstLine="0" w:right="0"/>
-              <w:spacing w:lineRule="auto" w:line="240" w:after="40" w:before="40"/>
+              <w:ind w:right="0" w:firstLine="0" w:left="0"/>
+              <w:spacing w:lineRule="auto" w:before="40" w:line="240" w:after="40"/>
             </w:pPr>
             <w:r>
               <w:t xml:space="preserve">XREF_SEC</w:t>
@@ -6585,8 +6585,8 @@
             <w:pPr>
               <w:pStyle w:val="Compact"/>
               <w:jc w:val="left"/>
-              <w:ind w:left="0" w:firstLine="0" w:right="0"/>
-              <w:spacing w:lineRule="auto" w:line="240" w:after="40" w:before="40"/>
+              <w:ind w:right="0" w:firstLine="0" w:left="0"/>
+              <w:spacing w:lineRule="auto" w:before="40" w:line="240" w:after="40"/>
             </w:pPr>
             <w:r>
               <w:rPr>
@@ -6602,8 +6602,8 @@
             <w:pPr>
               <w:pStyle w:val="Compact"/>
               <w:jc w:val="left"/>
-              <w:ind w:left="0" w:firstLine="0" w:right="0"/>
-              <w:spacing w:lineRule="auto" w:line="240" w:after="40" w:before="40"/>
+              <w:ind w:right="0" w:firstLine="0" w:left="0"/>
+              <w:spacing w:lineRule="auto" w:before="40" w:line="240" w:after="40"/>
             </w:pPr>
             <w:r>
               <w:t xml:space="preserve">—</w:t>
@@ -6616,8 +6616,8 @@
             <w:pPr>
               <w:pStyle w:val="Compact"/>
               <w:jc w:val="left"/>
-              <w:ind w:left="0" w:firstLine="0" w:right="0"/>
-              <w:spacing w:lineRule="auto" w:line="240" w:after="40" w:before="40"/>
+              <w:ind w:right="0" w:firstLine="0" w:left="0"/>
+              <w:spacing w:lineRule="auto" w:before="40" w:line="240" w:after="40"/>
             </w:pPr>
             <w:r>
               <w:t xml:space="preserve">—</w:t>
@@ -6630,8 +6630,8 @@
             <w:pPr>
               <w:pStyle w:val="Compact"/>
               <w:jc w:val="left"/>
-              <w:ind w:left="0" w:firstLine="0" w:right="0"/>
-              <w:spacing w:lineRule="auto" w:line="240" w:after="40" w:before="40"/>
+              <w:ind w:right="0" w:firstLine="0" w:left="0"/>
+              <w:spacing w:lineRule="auto" w:before="40" w:line="240" w:after="40"/>
             </w:pPr>
             <w:r>
               <w:rPr>
@@ -6648,8 +6648,8 @@
             <w:pPr>
               <w:pStyle w:val="Compact"/>
               <w:jc w:val="left"/>
-              <w:ind w:left="0" w:firstLine="0" w:right="0"/>
-              <w:spacing w:lineRule="auto" w:line="240" w:after="40" w:before="40"/>
+              <w:ind w:right="0" w:firstLine="0" w:left="0"/>
+              <w:spacing w:lineRule="auto" w:before="40" w:line="240" w:after="40"/>
             </w:pPr>
             <w:r>
               <w:t xml:space="preserve">eliminated</w:t>
@@ -6938,7 +6938,7 @@
     </w:p>
     <w:p>
       <w:pPr>
-        <w:spacing w:lineRule="exact" w:before="0" w:after="0" w:line="20"/>
+        <w:spacing w:line="20" w:before="0" w:after="0" w:lineRule="exact"/>
         <w:rPr>
           <w:sz w:val="2"/>
         </w:rPr>
@@ -6981,7 +6981,7 @@
       <w:r>
         <w:drawing>
           <wp:inline>
-            <wp:extent cx="5054600" cy="1320800"/>
+            <wp:extent cx="5232400" cy="1397000"/>
             <wp:effectExtent b="0" l="0" r="0" t="0"/>
             <wp:docPr descr="" title="" id="72" name="Picture"/>
             <a:graphic>
@@ -7002,7 +7002,7 @@
                   <pic:spPr bwMode="auto">
                     <a:xfrm>
                       <a:off x="0" y="0"/>
-                      <a:ext cx="5054600" cy="1320800"/>
+                      <a:ext cx="5232400" cy="1397000"/>
                     </a:xfrm>
                     <a:prstGeom prst="rect">
                       <a:avLst/>
@@ -8801,7 +8801,7 @@
     </w:p>
     <w:p>
       <w:pPr>
-        <w:spacing w:lineRule="exact" w:before="0" w:after="0" w:line="20"/>
+        <w:spacing w:line="20" w:before="0" w:after="0" w:lineRule="exact"/>
         <w:rPr>
           <w:sz w:val="2"/>
         </w:rPr>
@@ -8843,12 +8843,12 @@
         <w:tblLook w:firstRow="1" w:lastRow="0" w:firstColumn="0" w:lastColumn="0" w:noHBand="0" w:noVBand="0" w:val="0020"/>
         <w:jc w:val="start"/>
         <w:tblBorders>
-          <w:top w:val="single" w:color="000000" w:sz="6" w:space="0"/>
-          <w:left w:val="single" w:color="000000" w:sz="6" w:space="0"/>
-          <w:bottom w:val="single" w:color="000000" w:sz="6" w:space="0"/>
-          <w:right w:val="single" w:color="000000" w:sz="6" w:space="0"/>
-          <w:insideH w:val="single" w:color="000000" w:sz="6" w:space="0"/>
-          <w:insideV w:val="single" w:color="000000" w:sz="6" w:space="0"/>
+          <w:top w:sz="6" w:val="single" w:color="000000" w:space="0"/>
+          <w:left w:sz="6" w:val="single" w:color="000000" w:space="0"/>
+          <w:bottom w:sz="6" w:val="single" w:color="000000" w:space="0"/>
+          <w:right w:sz="6" w:val="single" w:color="000000" w:space="0"/>
+          <w:insideH w:sz="6" w:val="single" w:color="000000" w:space="0"/>
+          <w:insideV w:sz="6" w:val="single" w:color="000000" w:space="0"/>
         </w:tblBorders>
         <w:tblCellMar>
           <w:top w:w="57" w:type="dxa"/>
@@ -8868,14 +8868,14 @@
         </w:trPr>
         <w:tc>
           <w:tcPr>
-            <w:shd w:val="clear" w:color="auto" w:fill="E8E8E8"/>
+            <w:shd w:fill="E8E8E8" w:val="clear" w:color="auto"/>
           </w:tcPr>
           <w:p>
             <w:pPr>
               <w:pStyle w:val="Compact"/>
               <w:jc w:val="left"/>
-              <w:ind w:left="0" w:firstLine="0" w:right="0"/>
-              <w:spacing w:lineRule="auto" w:line="240" w:after="40" w:before="40"/>
+              <w:ind w:right="0" w:firstLine="0" w:left="0"/>
+              <w:spacing w:lineRule="auto" w:before="40" w:line="240" w:after="40"/>
             </w:pPr>
             <w:r>
               <w:rPr>
@@ -8887,14 +8887,14 @@
         </w:tc>
         <w:tc>
           <w:tcPr>
-            <w:shd w:val="clear" w:color="auto" w:fill="E8E8E8"/>
+            <w:shd w:fill="E8E8E8" w:val="clear" w:color="auto"/>
           </w:tcPr>
           <w:p>
             <w:pPr>
               <w:pStyle w:val="Compact"/>
               <w:jc w:val="left"/>
-              <w:ind w:left="0" w:firstLine="0" w:right="0"/>
-              <w:spacing w:lineRule="auto" w:line="240" w:after="40" w:before="40"/>
+              <w:ind w:right="0" w:firstLine="0" w:left="0"/>
+              <w:spacing w:lineRule="auto" w:before="40" w:line="240" w:after="40"/>
             </w:pPr>
             <w:r>
               <w:rPr>
@@ -8906,14 +8906,14 @@
         </w:tc>
         <w:tc>
           <w:tcPr>
-            <w:shd w:val="clear" w:color="auto" w:fill="E8E8E8"/>
+            <w:shd w:fill="E8E8E8" w:val="clear" w:color="auto"/>
           </w:tcPr>
           <w:p>
             <w:pPr>
               <w:pStyle w:val="Compact"/>
               <w:jc w:val="left"/>
-              <w:ind w:left="0" w:firstLine="0" w:right="0"/>
-              <w:spacing w:lineRule="auto" w:line="240" w:after="40" w:before="40"/>
+              <w:ind w:right="0" w:firstLine="0" w:left="0"/>
+              <w:spacing w:lineRule="auto" w:before="40" w:line="240" w:after="40"/>
             </w:pPr>
             <w:r>
               <w:rPr>
@@ -8931,8 +8931,8 @@
             <w:pPr>
               <w:pStyle w:val="Compact"/>
               <w:jc w:val="left"/>
-              <w:ind w:left="0" w:firstLine="0" w:right="0"/>
-              <w:spacing w:lineRule="auto" w:line="240" w:after="40" w:before="40"/>
+              <w:ind w:right="0" w:firstLine="0" w:left="0"/>
+              <w:spacing w:lineRule="auto" w:before="40" w:line="240" w:after="40"/>
             </w:pPr>
             <w:r>
               <w:t xml:space="preserve">STRING</w:t>
@@ -8945,8 +8945,8 @@
             <w:pPr>
               <w:pStyle w:val="Compact"/>
               <w:jc w:val="left"/>
-              <w:ind w:left="0" w:firstLine="0" w:right="0"/>
-              <w:spacing w:lineRule="auto" w:line="240" w:after="40" w:before="40"/>
+              <w:ind w:right="0" w:firstLine="0" w:left="0"/>
+              <w:spacing w:lineRule="auto" w:before="40" w:line="240" w:after="40"/>
             </w:pPr>
             <w:r>
               <w:t xml:space="preserve">Plain text</w:t>
@@ -8959,8 +8959,8 @@
             <w:pPr>
               <w:pStyle w:val="Compact"/>
               <w:jc w:val="left"/>
-              <w:ind w:left="0" w:firstLine="0" w:right="0"/>
-              <w:spacing w:lineRule="auto" w:line="240" w:after="40" w:before="40"/>
+              <w:ind w:right="0" w:firstLine="0" w:left="0"/>
+              <w:spacing w:lineRule="auto" w:before="40" w:line="240" w:after="40"/>
             </w:pPr>
             <w:r>
               <w:t xml:space="preserve">Unformatted text value</w:t>
@@ -8975,8 +8975,8 @@
             <w:pPr>
               <w:pStyle w:val="Compact"/>
               <w:jc w:val="left"/>
-              <w:ind w:left="0" w:firstLine="0" w:right="0"/>
-              <w:spacing w:lineRule="auto" w:line="240" w:after="40" w:before="40"/>
+              <w:ind w:right="0" w:firstLine="0" w:left="0"/>
+              <w:spacing w:lineRule="auto" w:before="40" w:line="240" w:after="40"/>
             </w:pPr>
             <w:r>
               <w:t xml:space="preserve">INTEGER</w:t>
@@ -8989,8 +8989,8 @@
             <w:pPr>
               <w:pStyle w:val="Compact"/>
               <w:jc w:val="left"/>
-              <w:ind w:left="0" w:firstLine="0" w:right="0"/>
-              <w:spacing w:lineRule="auto" w:line="240" w:after="40" w:before="40"/>
+              <w:ind w:right="0" w:firstLine="0" w:left="0"/>
+              <w:spacing w:lineRule="auto" w:before="40" w:line="240" w:after="40"/>
             </w:pPr>
             <w:r>
               <w:t xml:space="preserve">Whole number</w:t>
@@ -9003,8 +9003,8 @@
             <w:pPr>
               <w:pStyle w:val="Compact"/>
               <w:jc w:val="left"/>
-              <w:ind w:left="0" w:firstLine="0" w:right="0"/>
-              <w:spacing w:lineRule="auto" w:line="240" w:after="40" w:before="40"/>
+              <w:ind w:right="0" w:firstLine="0" w:left="0"/>
+              <w:spacing w:lineRule="auto" w:before="40" w:line="240" w:after="40"/>
             </w:pPr>
             <w:r>
               <w:t xml:space="preserve">Numeric value (supports min/max bounds)</w:t>
@@ -9019,8 +9019,8 @@
             <w:pPr>
               <w:pStyle w:val="Compact"/>
               <w:jc w:val="left"/>
-              <w:ind w:left="0" w:firstLine="0" w:right="0"/>
-              <w:spacing w:lineRule="auto" w:line="240" w:after="40" w:before="40"/>
+              <w:ind w:right="0" w:firstLine="0" w:left="0"/>
+              <w:spacing w:lineRule="auto" w:before="40" w:line="240" w:after="40"/>
             </w:pPr>
             <w:r>
               <w:t xml:space="preserve">REAL</w:t>
@@ -9033,8 +9033,8 @@
             <w:pPr>
               <w:pStyle w:val="Compact"/>
               <w:jc w:val="left"/>
-              <w:ind w:left="0" w:firstLine="0" w:right="0"/>
-              <w:spacing w:lineRule="auto" w:line="240" w:after="40" w:before="40"/>
+              <w:ind w:right="0" w:firstLine="0" w:left="0"/>
+              <w:spacing w:lineRule="auto" w:before="40" w:line="240" w:after="40"/>
             </w:pPr>
             <w:r>
               <w:t xml:space="preserve">Decimal number</w:t>
@@ -9047,8 +9047,8 @@
             <w:pPr>
               <w:pStyle w:val="Compact"/>
               <w:jc w:val="left"/>
-              <w:ind w:left="0" w:firstLine="0" w:right="0"/>
-              <w:spacing w:lineRule="auto" w:line="240" w:after="40" w:before="40"/>
+              <w:ind w:right="0" w:firstLine="0" w:left="0"/>
+              <w:spacing w:lineRule="auto" w:before="40" w:line="240" w:after="40"/>
             </w:pPr>
             <w:r>
               <w:t xml:space="preserve">Floating-point value (supports min/max bounds)</w:t>
@@ -9063,8 +9063,8 @@
             <w:pPr>
               <w:pStyle w:val="Compact"/>
               <w:jc w:val="left"/>
-              <w:ind w:left="0" w:firstLine="0" w:right="0"/>
-              <w:spacing w:lineRule="auto" w:line="240" w:after="40" w:before="40"/>
+              <w:ind w:right="0" w:firstLine="0" w:left="0"/>
+              <w:spacing w:lineRule="auto" w:before="40" w:line="240" w:after="40"/>
             </w:pPr>
             <w:r>
               <w:t xml:space="preserve">BOOLEAN</w:t>
@@ -9077,8 +9077,8 @@
             <w:pPr>
               <w:pStyle w:val="Compact"/>
               <w:jc w:val="left"/>
-              <w:ind w:left="0" w:firstLine="0" w:right="0"/>
-              <w:spacing w:lineRule="auto" w:line="240" w:after="40" w:before="40"/>
+              <w:ind w:right="0" w:firstLine="0" w:left="0"/>
+              <w:spacing w:lineRule="auto" w:before="40" w:line="240" w:after="40"/>
             </w:pPr>
             <w:r>
               <w:t xml:space="preserve">true / false</w:t>
@@ -9091,8 +9091,8 @@
             <w:pPr>
               <w:pStyle w:val="Compact"/>
               <w:jc w:val="left"/>
-              <w:ind w:left="0" w:firstLine="0" w:right="0"/>
-              <w:spacing w:lineRule="auto" w:line="240" w:after="40" w:before="40"/>
+              <w:ind w:right="0" w:firstLine="0" w:left="0"/>
+              <w:spacing w:lineRule="auto" w:before="40" w:line="240" w:after="40"/>
             </w:pPr>
             <w:r>
               <w:t xml:space="preserve">Boolean flag</w:t>
@@ -9107,8 +9107,8 @@
             <w:pPr>
               <w:pStyle w:val="Compact"/>
               <w:jc w:val="left"/>
-              <w:ind w:left="0" w:firstLine="0" w:right="0"/>
-              <w:spacing w:lineRule="auto" w:line="240" w:after="40" w:before="40"/>
+              <w:ind w:right="0" w:firstLine="0" w:left="0"/>
+              <w:spacing w:lineRule="auto" w:before="40" w:line="240" w:after="40"/>
             </w:pPr>
             <w:r>
               <w:t xml:space="preserve">DATE</w:t>
@@ -9121,8 +9121,8 @@
             <w:pPr>
               <w:pStyle w:val="Compact"/>
               <w:jc w:val="left"/>
-              <w:ind w:left="0" w:firstLine="0" w:right="0"/>
-              <w:spacing w:lineRule="auto" w:line="240" w:after="40" w:before="40"/>
+              <w:ind w:right="0" w:firstLine="0" w:left="0"/>
+              <w:spacing w:lineRule="auto" w:before="40" w:line="240" w:after="40"/>
             </w:pPr>
             <w:r>
               <w:t xml:space="preserve">YYYY-MM-DD</w:t>
@@ -9135,8 +9135,8 @@
             <w:pPr>
               <w:pStyle w:val="Compact"/>
               <w:jc w:val="left"/>
-              <w:ind w:left="0" w:firstLine="0" w:right="0"/>
-              <w:spacing w:lineRule="auto" w:line="240" w:after="40" w:before="40"/>
+              <w:ind w:right="0" w:firstLine="0" w:left="0"/>
+              <w:spacing w:lineRule="auto" w:before="40" w:line="240" w:after="40"/>
             </w:pPr>
             <w:r>
               <w:t xml:space="preserve">ISO 8601 date</w:t>
@@ -9151,8 +9151,8 @@
             <w:pPr>
               <w:pStyle w:val="Compact"/>
               <w:jc w:val="left"/>
-              <w:ind w:left="0" w:firstLine="0" w:right="0"/>
-              <w:spacing w:lineRule="auto" w:line="240" w:after="40" w:before="40"/>
+              <w:ind w:right="0" w:firstLine="0" w:left="0"/>
+              <w:spacing w:lineRule="auto" w:before="40" w:line="240" w:after="40"/>
             </w:pPr>
             <w:r>
               <w:t xml:space="preserve">ENUM</w:t>
@@ -9165,8 +9165,8 @@
             <w:pPr>
               <w:pStyle w:val="Compact"/>
               <w:jc w:val="left"/>
-              <w:ind w:left="0" w:firstLine="0" w:right="0"/>
-              <w:spacing w:lineRule="auto" w:line="240" w:after="40" w:before="40"/>
+              <w:ind w:right="0" w:firstLine="0" w:left="0"/>
+              <w:spacing w:lineRule="auto" w:before="40" w:line="240" w:after="40"/>
             </w:pPr>
             <w:r>
               <w:t xml:space="preserve">Named value</w:t>
@@ -9179,8 +9179,8 @@
             <w:pPr>
               <w:pStyle w:val="Compact"/>
               <w:jc w:val="left"/>
-              <w:ind w:left="0" w:firstLine="0" w:right="0"/>
-              <w:spacing w:lineRule="auto" w:line="240" w:after="40" w:before="40"/>
+              <w:ind w:right="0" w:firstLine="0" w:left="0"/>
+              <w:spacing w:lineRule="auto" w:before="40" w:line="240" w:after="40"/>
             </w:pPr>
             <w:r>
               <w:t xml:space="preserve">One of a model-declared set of values</w:t>
@@ -9195,8 +9195,8 @@
             <w:pPr>
               <w:pStyle w:val="Compact"/>
               <w:jc w:val="left"/>
-              <w:ind w:left="0" w:firstLine="0" w:right="0"/>
-              <w:spacing w:lineRule="auto" w:line="240" w:after="40" w:before="40"/>
+              <w:ind w:right="0" w:firstLine="0" w:left="0"/>
+              <w:spacing w:lineRule="auto" w:before="40" w:line="240" w:after="40"/>
             </w:pPr>
             <w:r>
               <w:t xml:space="preserve">XHTML</w:t>
@@ -9209,8 +9209,8 @@
             <w:pPr>
               <w:pStyle w:val="Compact"/>
               <w:jc w:val="left"/>
-              <w:ind w:left="0" w:firstLine="0" w:right="0"/>
-              <w:spacing w:lineRule="auto" w:line="240" w:after="40" w:before="40"/>
+              <w:ind w:right="0" w:firstLine="0" w:left="0"/>
+              <w:spacing w:lineRule="auto" w:before="40" w:line="240" w:after="40"/>
             </w:pPr>
             <w:r>
               <w:t xml:space="preserve">Markdown text</w:t>
@@ -9223,8 +9223,8 @@
             <w:pPr>
               <w:pStyle w:val="Compact"/>
               <w:jc w:val="left"/>
-              <w:ind w:left="0" w:firstLine="0" w:right="0"/>
-              <w:spacing w:lineRule="auto" w:line="240" w:after="40" w:before="40"/>
+              <w:ind w:right="0" w:firstLine="0" w:left="0"/>
+              <w:spacing w:lineRule="auto" w:before="40" w:line="240" w:after="40"/>
             </w:pPr>
             <w:r>
               <w:t xml:space="preserve">Rich text preserving block and inline formatting</w:t>
@@ -9765,12 +9765,12 @@
     <w:tblPr>
       <w:tblW w:w="5000" w:type="pct"/>
       <w:tblBorders>
-        <w:top w:val="single" w:color="CCCCCC" w:sz="4" w:space="1"/>
-        <w:bottom w:val="none" w:color="auto" w:sz="0" w:space="0"/>
-        <w:left w:val="none" w:color="auto" w:sz="0" w:space="0"/>
-        <w:right w:val="none" w:color="auto" w:sz="0" w:space="0"/>
-        <w:insideH w:val="none" w:color="auto" w:sz="0" w:space="0"/>
-        <w:insideV w:val="none" w:color="auto" w:sz="0" w:space="0"/>
+        <w:top w:sz="4" w:val="single" w:color="CCCCCC" w:space="1"/>
+        <w:bottom w:sz="0" w:val="none" w:color="auto" w:space="0"/>
+        <w:left w:sz="0" w:val="none" w:color="auto" w:space="0"/>
+        <w:right w:sz="0" w:val="none" w:color="auto" w:space="0"/>
+        <w:insideH w:sz="0" w:val="none" w:color="auto" w:space="0"/>
+        <w:insideV w:sz="0" w:val="none" w:color="auto" w:space="0"/>
       </w:tblBorders>
       <w:tblLayout w:type="fixed"/>
     </w:tblPr>
@@ -11175,11 +11175,11 @@
     <w:qFormat/>
     <w:pPr>
       <w:keepNext/>
-      <w:spacing w:lineRule="auto" w:line="276" w:after="120" w:before="280"/>
+      <w:spacing w:lineRule="auto" w:before="280" w:line="276" w:after="120"/>
       <w:outlineLvl w:val="0"/>
     </w:pPr>
     <w:rPr>
-      <w:rFonts w:hAnsi="Calibri Light" w:cs="Calibri Light" w:ascii="Calibri Light"/>
+      <w:rFonts w:hAnsi="Calibri Light" w:ascii="Calibri Light" w:cs="Calibri Light"/>
       <w:b/>
       <w:bCs/>
       <w:color w:val="0F4C64"/>

</xml_diff>

<commit_message>
Deploy documentation from v0.6
</commit_message>
<xml_diff>
--- a/commonspec/downloads/commonspec.docx
+++ b/commonspec/downloads/commonspec.docx
@@ -16,7 +16,7 @@
       <w:pPr>
         <w:pStyle w:val="TOCHeading"/>
       </w:pPr>
-      <w:bookmarkStart w:name="SPEC-sec1" w:id="28179"/>
+      <w:bookmarkStart w:id="28179" w:name="SPEC-sec1"/>
       <w:r>
         <w:rPr>
           <w:color w:val="000000"/>
@@ -1688,12 +1688,12 @@
     </w:p>
     <w:p>
       <w:pPr>
-        <w:spacing w:line="20" w:before="0" w:after="0" w:lineRule="exact"/>
+        <w:spacing w:lineRule="exact" w:before="0" w:line="20" w:after="0"/>
         <w:rPr>
           <w:sz w:val="2"/>
         </w:rPr>
       </w:pPr>
-      <w:bookmarkStart w:name="puml-grammar-spec" w:id="36907"/>
+      <w:bookmarkStart w:id="36907" w:name="puml-grammar-spec"/>
       <w:bookmarkEnd w:id="36907"/>
     </w:p>
     <w:p>
@@ -2396,12 +2396,12 @@
     </w:p>
     <w:p>
       <w:pPr>
-        <w:spacing w:line="20" w:before="0" w:after="0" w:lineRule="exact"/>
+        <w:spacing w:lineRule="exact" w:before="0" w:line="20" w:after="0"/>
         <w:rPr>
           <w:sz w:val="2"/>
         </w:rPr>
       </w:pPr>
-      <w:bookmarkStart w:name="puml-grammar-spec-object" w:id="45123"/>
+      <w:bookmarkStart w:id="45123" w:name="puml-grammar-spec-object"/>
       <w:bookmarkEnd w:id="45123"/>
     </w:p>
     <w:p>
@@ -3370,12 +3370,12 @@
     </w:p>
     <w:p>
       <w:pPr>
-        <w:spacing w:line="20" w:before="0" w:after="0" w:lineRule="exact"/>
+        <w:spacing w:lineRule="exact" w:before="0" w:line="20" w:after="0"/>
         <w:rPr>
           <w:sz w:val="2"/>
         </w:rPr>
       </w:pPr>
-      <w:bookmarkStart w:name="puml-grammar-spec-float" w:id="89146"/>
+      <w:bookmarkStart w:id="89146" w:name="puml-grammar-spec-float"/>
       <w:bookmarkEnd w:id="89146"/>
     </w:p>
     <w:p>
@@ -4312,12 +4312,12 @@
     </w:p>
     <w:p>
       <w:pPr>
-        <w:spacing w:line="20" w:before="0" w:after="0" w:lineRule="exact"/>
+        <w:spacing w:lineRule="exact" w:before="0" w:line="20" w:after="0"/>
         <w:rPr>
           <w:sz w:val="2"/>
         </w:rPr>
       </w:pPr>
-      <w:bookmarkStart w:name="puml-grammar-attribute" w:id="27150"/>
+      <w:bookmarkStart w:id="27150" w:name="puml-grammar-attribute"/>
       <w:bookmarkEnd w:id="27150"/>
     </w:p>
     <w:p>
@@ -5458,12 +5458,12 @@
     </w:p>
     <w:p>
       <w:pPr>
-        <w:spacing w:line="20" w:before="0" w:after="0" w:lineRule="exact"/>
+        <w:spacing w:lineRule="exact" w:before="0" w:line="20" w:after="0"/>
         <w:rPr>
           <w:sz w:val="2"/>
         </w:rPr>
       </w:pPr>
-      <w:bookmarkStart w:name="puml-grammar-spec-relation" w:id="79264"/>
+      <w:bookmarkStart w:id="79264" w:name="puml-grammar-spec-relation"/>
       <w:bookmarkEnd w:id="79264"/>
     </w:p>
     <w:p>
@@ -6232,12 +6232,12 @@
         <w:tblLook w:firstRow="1" w:lastRow="0" w:firstColumn="0" w:lastColumn="0" w:noHBand="0" w:noVBand="0" w:val="0020"/>
         <w:jc w:val="start"/>
         <w:tblBorders>
-          <w:top w:sz="6" w:val="single" w:color="000000" w:space="0"/>
-          <w:left w:sz="6" w:val="single" w:color="000000" w:space="0"/>
-          <w:bottom w:sz="6" w:val="single" w:color="000000" w:space="0"/>
-          <w:right w:sz="6" w:val="single" w:color="000000" w:space="0"/>
-          <w:insideH w:sz="6" w:val="single" w:color="000000" w:space="0"/>
-          <w:insideV w:sz="6" w:val="single" w:color="000000" w:space="0"/>
+          <w:top w:color="000000" w:space="0" w:val="single" w:sz="6"/>
+          <w:left w:color="000000" w:space="0" w:val="single" w:sz="6"/>
+          <w:bottom w:color="000000" w:space="0" w:val="single" w:sz="6"/>
+          <w:right w:color="000000" w:space="0" w:val="single" w:sz="6"/>
+          <w:insideH w:color="000000" w:space="0" w:val="single" w:sz="6"/>
+          <w:insideV w:color="000000" w:space="0" w:val="single" w:sz="6"/>
         </w:tblBorders>
         <w:tblCellMar>
           <w:top w:w="57" w:type="dxa"/>
@@ -6266,8 +6266,8 @@
             <w:pPr>
               <w:pStyle w:val="Compact"/>
               <w:jc w:val="left"/>
-              <w:ind w:right="0" w:firstLine="0" w:left="0"/>
-              <w:spacing w:lineRule="auto" w:before="40" w:line="240" w:after="40"/>
+              <w:ind w:right="0" w:left="0" w:firstLine="0"/>
+              <w:spacing w:line="240" w:lineRule="auto" w:before="40" w:after="40"/>
             </w:pPr>
             <w:r>
               <w:rPr>
@@ -6285,8 +6285,8 @@
             <w:pPr>
               <w:pStyle w:val="Compact"/>
               <w:jc w:val="left"/>
-              <w:ind w:right="0" w:firstLine="0" w:left="0"/>
-              <w:spacing w:lineRule="auto" w:before="40" w:line="240" w:after="40"/>
+              <w:ind w:right="0" w:left="0" w:firstLine="0"/>
+              <w:spacing w:line="240" w:lineRule="auto" w:before="40" w:after="40"/>
             </w:pPr>
             <w:r>
               <w:rPr>
@@ -6304,8 +6304,8 @@
             <w:pPr>
               <w:pStyle w:val="Compact"/>
               <w:jc w:val="left"/>
-              <w:ind w:right="0" w:firstLine="0" w:left="0"/>
-              <w:spacing w:lineRule="auto" w:before="40" w:line="240" w:after="40"/>
+              <w:ind w:right="0" w:left="0" w:firstLine="0"/>
+              <w:spacing w:line="240" w:lineRule="auto" w:before="40" w:after="40"/>
             </w:pPr>
             <w:r>
               <w:rPr>
@@ -6323,8 +6323,8 @@
             <w:pPr>
               <w:pStyle w:val="Compact"/>
               <w:jc w:val="left"/>
-              <w:ind w:right="0" w:firstLine="0" w:left="0"/>
-              <w:spacing w:lineRule="auto" w:before="40" w:line="240" w:after="40"/>
+              <w:ind w:right="0" w:left="0" w:firstLine="0"/>
+              <w:spacing w:line="240" w:lineRule="auto" w:before="40" w:after="40"/>
             </w:pPr>
             <w:r>
               <w:rPr>
@@ -6342,8 +6342,8 @@
             <w:pPr>
               <w:pStyle w:val="Compact"/>
               <w:jc w:val="left"/>
-              <w:ind w:right="0" w:firstLine="0" w:left="0"/>
-              <w:spacing w:lineRule="auto" w:before="40" w:line="240" w:after="40"/>
+              <w:ind w:right="0" w:left="0" w:firstLine="0"/>
+              <w:spacing w:line="240" w:lineRule="auto" w:before="40" w:after="40"/>
             </w:pPr>
             <w:r>
               <w:rPr>
@@ -6361,8 +6361,8 @@
             <w:pPr>
               <w:pStyle w:val="Compact"/>
               <w:jc w:val="left"/>
-              <w:ind w:right="0" w:firstLine="0" w:left="0"/>
-              <w:spacing w:lineRule="auto" w:before="40" w:line="240" w:after="40"/>
+              <w:ind w:right="0" w:left="0" w:firstLine="0"/>
+              <w:spacing w:line="240" w:lineRule="auto" w:before="40" w:after="40"/>
             </w:pPr>
             <w:r>
               <w:rPr>
@@ -6380,8 +6380,8 @@
             <w:pPr>
               <w:pStyle w:val="Compact"/>
               <w:jc w:val="left"/>
-              <w:ind w:right="0" w:firstLine="0" w:left="0"/>
-              <w:spacing w:lineRule="auto" w:before="40" w:line="240" w:after="40"/>
+              <w:ind w:right="0" w:left="0" w:firstLine="0"/>
+              <w:spacing w:line="240" w:lineRule="auto" w:before="40" w:after="40"/>
             </w:pPr>
             <w:r>
               <w:t xml:space="preserve">VERIFIES</w:t>
@@ -6394,8 +6394,8 @@
             <w:pPr>
               <w:pStyle w:val="Compact"/>
               <w:jc w:val="left"/>
-              <w:ind w:right="0" w:firstLine="0" w:left="0"/>
-              <w:spacing w:lineRule="auto" w:before="40" w:line="240" w:after="40"/>
+              <w:ind w:right="0" w:left="0" w:firstLine="0"/>
+              <w:spacing w:line="240" w:lineRule="auto" w:before="40" w:after="40"/>
             </w:pPr>
             <w:r>
               <w:rPr>
@@ -6411,8 +6411,8 @@
             <w:pPr>
               <w:pStyle w:val="Compact"/>
               <w:jc w:val="left"/>
-              <w:ind w:right="0" w:firstLine="0" w:left="0"/>
-              <w:spacing w:lineRule="auto" w:before="40" w:line="240" w:after="40"/>
+              <w:ind w:right="0" w:left="0" w:firstLine="0"/>
+              <w:spacing w:line="240" w:lineRule="auto" w:before="40" w:after="40"/>
             </w:pPr>
             <w:r>
               <w:rPr>
@@ -6428,8 +6428,8 @@
             <w:pPr>
               <w:pStyle w:val="Compact"/>
               <w:jc w:val="left"/>
-              <w:ind w:right="0" w:firstLine="0" w:left="0"/>
-              <w:spacing w:lineRule="auto" w:before="40" w:line="240" w:after="40"/>
+              <w:ind w:right="0" w:left="0" w:firstLine="0"/>
+              <w:spacing w:line="240" w:lineRule="auto" w:before="40" w:after="40"/>
             </w:pPr>
             <w:r>
               <w:rPr>
@@ -6445,8 +6445,8 @@
             <w:pPr>
               <w:pStyle w:val="Compact"/>
               <w:jc w:val="left"/>
-              <w:ind w:right="0" w:firstLine="0" w:left="0"/>
-              <w:spacing w:lineRule="auto" w:before="40" w:line="240" w:after="40"/>
+              <w:ind w:right="0" w:left="0" w:firstLine="0"/>
+              <w:spacing w:line="240" w:lineRule="auto" w:before="40" w:after="40"/>
             </w:pPr>
             <w:r>
               <w:rPr>
@@ -6462,8 +6462,8 @@
             <w:pPr>
               <w:pStyle w:val="Compact"/>
               <w:jc w:val="left"/>
-              <w:ind w:right="0" w:firstLine="0" w:left="0"/>
-              <w:spacing w:lineRule="auto" w:before="40" w:line="240" w:after="40"/>
+              <w:ind w:right="0" w:left="0" w:firstLine="0"/>
+              <w:spacing w:line="240" w:lineRule="auto" w:before="40" w:after="40"/>
             </w:pPr>
             <w:r>
               <w:rPr>
@@ -6482,8 +6482,8 @@
             <w:pPr>
               <w:pStyle w:val="Compact"/>
               <w:jc w:val="left"/>
-              <w:ind w:right="0" w:firstLine="0" w:left="0"/>
-              <w:spacing w:lineRule="auto" w:before="40" w:line="240" w:after="40"/>
+              <w:ind w:right="0" w:left="0" w:firstLine="0"/>
+              <w:spacing w:line="240" w:lineRule="auto" w:before="40" w:after="40"/>
             </w:pPr>
             <w:r>
               <w:t xml:space="preserve">TRACES_TO</w:t>
@@ -6496,8 +6496,8 @@
             <w:pPr>
               <w:pStyle w:val="Compact"/>
               <w:jc w:val="left"/>
-              <w:ind w:right="0" w:firstLine="0" w:left="0"/>
-              <w:spacing w:lineRule="auto" w:before="40" w:line="240" w:after="40"/>
+              <w:ind w:right="0" w:left="0" w:firstLine="0"/>
+              <w:spacing w:line="240" w:lineRule="auto" w:before="40" w:after="40"/>
             </w:pPr>
             <w:r>
               <w:rPr>
@@ -6513,8 +6513,8 @@
             <w:pPr>
               <w:pStyle w:val="Compact"/>
               <w:jc w:val="left"/>
-              <w:ind w:right="0" w:firstLine="0" w:left="0"/>
-              <w:spacing w:lineRule="auto" w:before="40" w:line="240" w:after="40"/>
+              <w:ind w:right="0" w:left="0" w:firstLine="0"/>
+              <w:spacing w:line="240" w:lineRule="auto" w:before="40" w:after="40"/>
             </w:pPr>
             <w:r>
               <w:t xml:space="preserve">—</w:t>
@@ -6527,8 +6527,8 @@
             <w:pPr>
               <w:pStyle w:val="Compact"/>
               <w:jc w:val="left"/>
-              <w:ind w:right="0" w:firstLine="0" w:left="0"/>
-              <w:spacing w:lineRule="auto" w:before="40" w:line="240" w:after="40"/>
+              <w:ind w:right="0" w:left="0" w:firstLine="0"/>
+              <w:spacing w:line="240" w:lineRule="auto" w:before="40" w:after="40"/>
             </w:pPr>
             <w:r>
               <w:t xml:space="preserve">—</w:t>
@@ -6541,8 +6541,8 @@
             <w:pPr>
               <w:pStyle w:val="Compact"/>
               <w:jc w:val="left"/>
-              <w:ind w:right="0" w:firstLine="0" w:left="0"/>
-              <w:spacing w:lineRule="auto" w:before="40" w:line="240" w:after="40"/>
+              <w:ind w:right="0" w:left="0" w:firstLine="0"/>
+              <w:spacing w:line="240" w:lineRule="auto" w:before="40" w:after="40"/>
             </w:pPr>
             <w:r>
               <w:t xml:space="preserve">—</w:t>
@@ -6555,8 +6555,8 @@
             <w:pPr>
               <w:pStyle w:val="Compact"/>
               <w:jc w:val="left"/>
-              <w:ind w:right="0" w:firstLine="0" w:left="0"/>
-              <w:spacing w:lineRule="auto" w:before="40" w:line="240" w:after="40"/>
+              <w:ind w:right="0" w:left="0" w:firstLine="0"/>
+              <w:spacing w:line="240" w:lineRule="auto" w:before="40" w:after="40"/>
             </w:pPr>
             <w:r>
               <w:t xml:space="preserve">1</w:t>
@@ -6571,8 +6571,8 @@
             <w:pPr>
               <w:pStyle w:val="Compact"/>
               <w:jc w:val="left"/>
-              <w:ind w:right="0" w:firstLine="0" w:left="0"/>
-              <w:spacing w:lineRule="auto" w:before="40" w:line="240" w:after="40"/>
+              <w:ind w:right="0" w:left="0" w:firstLine="0"/>
+              <w:spacing w:line="240" w:lineRule="auto" w:before="40" w:after="40"/>
             </w:pPr>
             <w:r>
               <w:t xml:space="preserve">XREF_SEC</w:t>
@@ -6585,8 +6585,8 @@
             <w:pPr>
               <w:pStyle w:val="Compact"/>
               <w:jc w:val="left"/>
-              <w:ind w:right="0" w:firstLine="0" w:left="0"/>
-              <w:spacing w:lineRule="auto" w:before="40" w:line="240" w:after="40"/>
+              <w:ind w:right="0" w:left="0" w:firstLine="0"/>
+              <w:spacing w:line="240" w:lineRule="auto" w:before="40" w:after="40"/>
             </w:pPr>
             <w:r>
               <w:rPr>
@@ -6602,8 +6602,8 @@
             <w:pPr>
               <w:pStyle w:val="Compact"/>
               <w:jc w:val="left"/>
-              <w:ind w:right="0" w:firstLine="0" w:left="0"/>
-              <w:spacing w:lineRule="auto" w:before="40" w:line="240" w:after="40"/>
+              <w:ind w:right="0" w:left="0" w:firstLine="0"/>
+              <w:spacing w:line="240" w:lineRule="auto" w:before="40" w:after="40"/>
             </w:pPr>
             <w:r>
               <w:t xml:space="preserve">—</w:t>
@@ -6616,8 +6616,8 @@
             <w:pPr>
               <w:pStyle w:val="Compact"/>
               <w:jc w:val="left"/>
-              <w:ind w:right="0" w:firstLine="0" w:left="0"/>
-              <w:spacing w:lineRule="auto" w:before="40" w:line="240" w:after="40"/>
+              <w:ind w:right="0" w:left="0" w:firstLine="0"/>
+              <w:spacing w:line="240" w:lineRule="auto" w:before="40" w:after="40"/>
             </w:pPr>
             <w:r>
               <w:t xml:space="preserve">—</w:t>
@@ -6630,8 +6630,8 @@
             <w:pPr>
               <w:pStyle w:val="Compact"/>
               <w:jc w:val="left"/>
-              <w:ind w:right="0" w:firstLine="0" w:left="0"/>
-              <w:spacing w:lineRule="auto" w:before="40" w:line="240" w:after="40"/>
+              <w:ind w:right="0" w:left="0" w:firstLine="0"/>
+              <w:spacing w:line="240" w:lineRule="auto" w:before="40" w:after="40"/>
             </w:pPr>
             <w:r>
               <w:rPr>
@@ -6648,8 +6648,8 @@
             <w:pPr>
               <w:pStyle w:val="Compact"/>
               <w:jc w:val="left"/>
-              <w:ind w:right="0" w:firstLine="0" w:left="0"/>
-              <w:spacing w:lineRule="auto" w:before="40" w:line="240" w:after="40"/>
+              <w:ind w:right="0" w:left="0" w:firstLine="0"/>
+              <w:spacing w:line="240" w:lineRule="auto" w:before="40" w:after="40"/>
             </w:pPr>
             <w:r>
               <w:t xml:space="preserve">eliminated</w:t>
@@ -6938,12 +6938,12 @@
     </w:p>
     <w:p>
       <w:pPr>
-        <w:spacing w:line="20" w:before="0" w:after="0" w:lineRule="exact"/>
+        <w:spacing w:lineRule="exact" w:before="0" w:line="20" w:after="0"/>
         <w:rPr>
           <w:sz w:val="2"/>
         </w:rPr>
       </w:pPr>
-      <w:bookmarkStart w:name="puml-grammar-spec-view" w:id="24745"/>
+      <w:bookmarkStart w:id="24745" w:name="puml-grammar-spec-view"/>
       <w:bookmarkEnd w:id="24745"/>
     </w:p>
     <w:p>
@@ -8801,12 +8801,12 @@
     </w:p>
     <w:p>
       <w:pPr>
-        <w:spacing w:line="20" w:before="0" w:after="0" w:lineRule="exact"/>
+        <w:spacing w:lineRule="exact" w:before="0" w:line="20" w:after="0"/>
         <w:rPr>
           <w:sz w:val="2"/>
         </w:rPr>
       </w:pPr>
-      <w:bookmarkStart w:name="csv-primitive-datatypes" w:id="46083"/>
+      <w:bookmarkStart w:id="46083" w:name="csv-primitive-datatypes"/>
       <w:bookmarkEnd w:id="46083"/>
     </w:p>
     <w:p>
@@ -8843,12 +8843,12 @@
         <w:tblLook w:firstRow="1" w:lastRow="0" w:firstColumn="0" w:lastColumn="0" w:noHBand="0" w:noVBand="0" w:val="0020"/>
         <w:jc w:val="start"/>
         <w:tblBorders>
-          <w:top w:sz="6" w:val="single" w:color="000000" w:space="0"/>
-          <w:left w:sz="6" w:val="single" w:color="000000" w:space="0"/>
-          <w:bottom w:sz="6" w:val="single" w:color="000000" w:space="0"/>
-          <w:right w:sz="6" w:val="single" w:color="000000" w:space="0"/>
-          <w:insideH w:sz="6" w:val="single" w:color="000000" w:space="0"/>
-          <w:insideV w:sz="6" w:val="single" w:color="000000" w:space="0"/>
+          <w:top w:color="000000" w:space="0" w:val="single" w:sz="6"/>
+          <w:left w:color="000000" w:space="0" w:val="single" w:sz="6"/>
+          <w:bottom w:color="000000" w:space="0" w:val="single" w:sz="6"/>
+          <w:right w:color="000000" w:space="0" w:val="single" w:sz="6"/>
+          <w:insideH w:color="000000" w:space="0" w:val="single" w:sz="6"/>
+          <w:insideV w:color="000000" w:space="0" w:val="single" w:sz="6"/>
         </w:tblBorders>
         <w:tblCellMar>
           <w:top w:w="57" w:type="dxa"/>
@@ -8874,8 +8874,8 @@
             <w:pPr>
               <w:pStyle w:val="Compact"/>
               <w:jc w:val="left"/>
-              <w:ind w:right="0" w:firstLine="0" w:left="0"/>
-              <w:spacing w:lineRule="auto" w:before="40" w:line="240" w:after="40"/>
+              <w:ind w:right="0" w:left="0" w:firstLine="0"/>
+              <w:spacing w:line="240" w:lineRule="auto" w:before="40" w:after="40"/>
             </w:pPr>
             <w:r>
               <w:rPr>
@@ -8893,8 +8893,8 @@
             <w:pPr>
               <w:pStyle w:val="Compact"/>
               <w:jc w:val="left"/>
-              <w:ind w:right="0" w:firstLine="0" w:left="0"/>
-              <w:spacing w:lineRule="auto" w:before="40" w:line="240" w:after="40"/>
+              <w:ind w:right="0" w:left="0" w:firstLine="0"/>
+              <w:spacing w:line="240" w:lineRule="auto" w:before="40" w:after="40"/>
             </w:pPr>
             <w:r>
               <w:rPr>
@@ -8912,8 +8912,8 @@
             <w:pPr>
               <w:pStyle w:val="Compact"/>
               <w:jc w:val="left"/>
-              <w:ind w:right="0" w:firstLine="0" w:left="0"/>
-              <w:spacing w:lineRule="auto" w:before="40" w:line="240" w:after="40"/>
+              <w:ind w:right="0" w:left="0" w:firstLine="0"/>
+              <w:spacing w:line="240" w:lineRule="auto" w:before="40" w:after="40"/>
             </w:pPr>
             <w:r>
               <w:rPr>
@@ -8931,8 +8931,8 @@
             <w:pPr>
               <w:pStyle w:val="Compact"/>
               <w:jc w:val="left"/>
-              <w:ind w:right="0" w:firstLine="0" w:left="0"/>
-              <w:spacing w:lineRule="auto" w:before="40" w:line="240" w:after="40"/>
+              <w:ind w:right="0" w:left="0" w:firstLine="0"/>
+              <w:spacing w:line="240" w:lineRule="auto" w:before="40" w:after="40"/>
             </w:pPr>
             <w:r>
               <w:t xml:space="preserve">STRING</w:t>
@@ -8945,8 +8945,8 @@
             <w:pPr>
               <w:pStyle w:val="Compact"/>
               <w:jc w:val="left"/>
-              <w:ind w:right="0" w:firstLine="0" w:left="0"/>
-              <w:spacing w:lineRule="auto" w:before="40" w:line="240" w:after="40"/>
+              <w:ind w:right="0" w:left="0" w:firstLine="0"/>
+              <w:spacing w:line="240" w:lineRule="auto" w:before="40" w:after="40"/>
             </w:pPr>
             <w:r>
               <w:t xml:space="preserve">Plain text</w:t>
@@ -8959,8 +8959,8 @@
             <w:pPr>
               <w:pStyle w:val="Compact"/>
               <w:jc w:val="left"/>
-              <w:ind w:right="0" w:firstLine="0" w:left="0"/>
-              <w:spacing w:lineRule="auto" w:before="40" w:line="240" w:after="40"/>
+              <w:ind w:right="0" w:left="0" w:firstLine="0"/>
+              <w:spacing w:line="240" w:lineRule="auto" w:before="40" w:after="40"/>
             </w:pPr>
             <w:r>
               <w:t xml:space="preserve">Unformatted text value</w:t>
@@ -8975,8 +8975,8 @@
             <w:pPr>
               <w:pStyle w:val="Compact"/>
               <w:jc w:val="left"/>
-              <w:ind w:right="0" w:firstLine="0" w:left="0"/>
-              <w:spacing w:lineRule="auto" w:before="40" w:line="240" w:after="40"/>
+              <w:ind w:right="0" w:left="0" w:firstLine="0"/>
+              <w:spacing w:line="240" w:lineRule="auto" w:before="40" w:after="40"/>
             </w:pPr>
             <w:r>
               <w:t xml:space="preserve">INTEGER</w:t>
@@ -8989,8 +8989,8 @@
             <w:pPr>
               <w:pStyle w:val="Compact"/>
               <w:jc w:val="left"/>
-              <w:ind w:right="0" w:firstLine="0" w:left="0"/>
-              <w:spacing w:lineRule="auto" w:before="40" w:line="240" w:after="40"/>
+              <w:ind w:right="0" w:left="0" w:firstLine="0"/>
+              <w:spacing w:line="240" w:lineRule="auto" w:before="40" w:after="40"/>
             </w:pPr>
             <w:r>
               <w:t xml:space="preserve">Whole number</w:t>
@@ -9003,8 +9003,8 @@
             <w:pPr>
               <w:pStyle w:val="Compact"/>
               <w:jc w:val="left"/>
-              <w:ind w:right="0" w:firstLine="0" w:left="0"/>
-              <w:spacing w:lineRule="auto" w:before="40" w:line="240" w:after="40"/>
+              <w:ind w:right="0" w:left="0" w:firstLine="0"/>
+              <w:spacing w:line="240" w:lineRule="auto" w:before="40" w:after="40"/>
             </w:pPr>
             <w:r>
               <w:t xml:space="preserve">Numeric value (supports min/max bounds)</w:t>
@@ -9019,8 +9019,8 @@
             <w:pPr>
               <w:pStyle w:val="Compact"/>
               <w:jc w:val="left"/>
-              <w:ind w:right="0" w:firstLine="0" w:left="0"/>
-              <w:spacing w:lineRule="auto" w:before="40" w:line="240" w:after="40"/>
+              <w:ind w:right="0" w:left="0" w:firstLine="0"/>
+              <w:spacing w:line="240" w:lineRule="auto" w:before="40" w:after="40"/>
             </w:pPr>
             <w:r>
               <w:t xml:space="preserve">REAL</w:t>
@@ -9033,8 +9033,8 @@
             <w:pPr>
               <w:pStyle w:val="Compact"/>
               <w:jc w:val="left"/>
-              <w:ind w:right="0" w:firstLine="0" w:left="0"/>
-              <w:spacing w:lineRule="auto" w:before="40" w:line="240" w:after="40"/>
+              <w:ind w:right="0" w:left="0" w:firstLine="0"/>
+              <w:spacing w:line="240" w:lineRule="auto" w:before="40" w:after="40"/>
             </w:pPr>
             <w:r>
               <w:t xml:space="preserve">Decimal number</w:t>
@@ -9047,8 +9047,8 @@
             <w:pPr>
               <w:pStyle w:val="Compact"/>
               <w:jc w:val="left"/>
-              <w:ind w:right="0" w:firstLine="0" w:left="0"/>
-              <w:spacing w:lineRule="auto" w:before="40" w:line="240" w:after="40"/>
+              <w:ind w:right="0" w:left="0" w:firstLine="0"/>
+              <w:spacing w:line="240" w:lineRule="auto" w:before="40" w:after="40"/>
             </w:pPr>
             <w:r>
               <w:t xml:space="preserve">Floating-point value (supports min/max bounds)</w:t>
@@ -9063,8 +9063,8 @@
             <w:pPr>
               <w:pStyle w:val="Compact"/>
               <w:jc w:val="left"/>
-              <w:ind w:right="0" w:firstLine="0" w:left="0"/>
-              <w:spacing w:lineRule="auto" w:before="40" w:line="240" w:after="40"/>
+              <w:ind w:right="0" w:left="0" w:firstLine="0"/>
+              <w:spacing w:line="240" w:lineRule="auto" w:before="40" w:after="40"/>
             </w:pPr>
             <w:r>
               <w:t xml:space="preserve">BOOLEAN</w:t>
@@ -9077,8 +9077,8 @@
             <w:pPr>
               <w:pStyle w:val="Compact"/>
               <w:jc w:val="left"/>
-              <w:ind w:right="0" w:firstLine="0" w:left="0"/>
-              <w:spacing w:lineRule="auto" w:before="40" w:line="240" w:after="40"/>
+              <w:ind w:right="0" w:left="0" w:firstLine="0"/>
+              <w:spacing w:line="240" w:lineRule="auto" w:before="40" w:after="40"/>
             </w:pPr>
             <w:r>
               <w:t xml:space="preserve">true / false</w:t>
@@ -9091,8 +9091,8 @@
             <w:pPr>
               <w:pStyle w:val="Compact"/>
               <w:jc w:val="left"/>
-              <w:ind w:right="0" w:firstLine="0" w:left="0"/>
-              <w:spacing w:lineRule="auto" w:before="40" w:line="240" w:after="40"/>
+              <w:ind w:right="0" w:left="0" w:firstLine="0"/>
+              <w:spacing w:line="240" w:lineRule="auto" w:before="40" w:after="40"/>
             </w:pPr>
             <w:r>
               <w:t xml:space="preserve">Boolean flag</w:t>
@@ -9107,8 +9107,8 @@
             <w:pPr>
               <w:pStyle w:val="Compact"/>
               <w:jc w:val="left"/>
-              <w:ind w:right="0" w:firstLine="0" w:left="0"/>
-              <w:spacing w:lineRule="auto" w:before="40" w:line="240" w:after="40"/>
+              <w:ind w:right="0" w:left="0" w:firstLine="0"/>
+              <w:spacing w:line="240" w:lineRule="auto" w:before="40" w:after="40"/>
             </w:pPr>
             <w:r>
               <w:t xml:space="preserve">DATE</w:t>
@@ -9121,8 +9121,8 @@
             <w:pPr>
               <w:pStyle w:val="Compact"/>
               <w:jc w:val="left"/>
-              <w:ind w:right="0" w:firstLine="0" w:left="0"/>
-              <w:spacing w:lineRule="auto" w:before="40" w:line="240" w:after="40"/>
+              <w:ind w:right="0" w:left="0" w:firstLine="0"/>
+              <w:spacing w:line="240" w:lineRule="auto" w:before="40" w:after="40"/>
             </w:pPr>
             <w:r>
               <w:t xml:space="preserve">YYYY-MM-DD</w:t>
@@ -9135,8 +9135,8 @@
             <w:pPr>
               <w:pStyle w:val="Compact"/>
               <w:jc w:val="left"/>
-              <w:ind w:right="0" w:firstLine="0" w:left="0"/>
-              <w:spacing w:lineRule="auto" w:before="40" w:line="240" w:after="40"/>
+              <w:ind w:right="0" w:left="0" w:firstLine="0"/>
+              <w:spacing w:line="240" w:lineRule="auto" w:before="40" w:after="40"/>
             </w:pPr>
             <w:r>
               <w:t xml:space="preserve">ISO 8601 date</w:t>
@@ -9151,8 +9151,8 @@
             <w:pPr>
               <w:pStyle w:val="Compact"/>
               <w:jc w:val="left"/>
-              <w:ind w:right="0" w:firstLine="0" w:left="0"/>
-              <w:spacing w:lineRule="auto" w:before="40" w:line="240" w:after="40"/>
+              <w:ind w:right="0" w:left="0" w:firstLine="0"/>
+              <w:spacing w:line="240" w:lineRule="auto" w:before="40" w:after="40"/>
             </w:pPr>
             <w:r>
               <w:t xml:space="preserve">ENUM</w:t>
@@ -9165,8 +9165,8 @@
             <w:pPr>
               <w:pStyle w:val="Compact"/>
               <w:jc w:val="left"/>
-              <w:ind w:right="0" w:firstLine="0" w:left="0"/>
-              <w:spacing w:lineRule="auto" w:before="40" w:line="240" w:after="40"/>
+              <w:ind w:right="0" w:left="0" w:firstLine="0"/>
+              <w:spacing w:line="240" w:lineRule="auto" w:before="40" w:after="40"/>
             </w:pPr>
             <w:r>
               <w:t xml:space="preserve">Named value</w:t>
@@ -9179,8 +9179,8 @@
             <w:pPr>
               <w:pStyle w:val="Compact"/>
               <w:jc w:val="left"/>
-              <w:ind w:right="0" w:firstLine="0" w:left="0"/>
-              <w:spacing w:lineRule="auto" w:before="40" w:line="240" w:after="40"/>
+              <w:ind w:right="0" w:left="0" w:firstLine="0"/>
+              <w:spacing w:line="240" w:lineRule="auto" w:before="40" w:after="40"/>
             </w:pPr>
             <w:r>
               <w:t xml:space="preserve">One of a model-declared set of values</w:t>
@@ -9195,8 +9195,8 @@
             <w:pPr>
               <w:pStyle w:val="Compact"/>
               <w:jc w:val="left"/>
-              <w:ind w:right="0" w:firstLine="0" w:left="0"/>
-              <w:spacing w:lineRule="auto" w:before="40" w:line="240" w:after="40"/>
+              <w:ind w:right="0" w:left="0" w:firstLine="0"/>
+              <w:spacing w:line="240" w:lineRule="auto" w:before="40" w:after="40"/>
             </w:pPr>
             <w:r>
               <w:t xml:space="preserve">XHTML</w:t>
@@ -9209,8 +9209,8 @@
             <w:pPr>
               <w:pStyle w:val="Compact"/>
               <w:jc w:val="left"/>
-              <w:ind w:right="0" w:firstLine="0" w:left="0"/>
-              <w:spacing w:lineRule="auto" w:before="40" w:line="240" w:after="40"/>
+              <w:ind w:right="0" w:left="0" w:firstLine="0"/>
+              <w:spacing w:line="240" w:lineRule="auto" w:before="40" w:after="40"/>
             </w:pPr>
             <w:r>
               <w:t xml:space="preserve">Markdown text</w:t>
@@ -9223,8 +9223,8 @@
             <w:pPr>
               <w:pStyle w:val="Compact"/>
               <w:jc w:val="left"/>
-              <w:ind w:right="0" w:firstLine="0" w:left="0"/>
-              <w:spacing w:lineRule="auto" w:before="40" w:line="240" w:after="40"/>
+              <w:ind w:right="0" w:left="0" w:firstLine="0"/>
+              <w:spacing w:line="240" w:lineRule="auto" w:before="40" w:after="40"/>
             </w:pPr>
             <w:r>
               <w:t xml:space="preserve">Rich text preserving block and inline formatting</w:t>
@@ -9746,9 +9746,9 @@
     </w:p>
     <w:bookmarkEnd w:id="90"/>
     <w:sectPr>
-      <w:footerReference r:id="rId9200" w:type="default"/>
-      <w:headerReference r:id="rId9101" w:type="default"/>
-      <w:headerReference r:id="rId9100" w:type="first"/>
+      <w:footerReference w:type="default" r:id="rId9200"/>
+      <w:headerReference w:type="default" r:id="rId9101"/>
+      <w:headerReference w:type="first" r:id="rId9100"/>
       <w:titlePg/>
     </w:sectPr>
   </w:body>
@@ -9765,12 +9765,12 @@
     <w:tblPr>
       <w:tblW w:w="5000" w:type="pct"/>
       <w:tblBorders>
-        <w:top w:sz="4" w:val="single" w:color="CCCCCC" w:space="1"/>
-        <w:bottom w:sz="0" w:val="none" w:color="auto" w:space="0"/>
-        <w:left w:sz="0" w:val="none" w:color="auto" w:space="0"/>
-        <w:right w:sz="0" w:val="none" w:color="auto" w:space="0"/>
-        <w:insideH w:sz="0" w:val="none" w:color="auto" w:space="0"/>
-        <w:insideV w:sz="0" w:val="none" w:color="auto" w:space="0"/>
+        <w:top w:color="CCCCCC" w:space="1" w:val="single" w:sz="4"/>
+        <w:bottom w:color="auto" w:space="0" w:val="none" w:sz="0"/>
+        <w:left w:color="auto" w:space="0" w:val="none" w:sz="0"/>
+        <w:right w:color="auto" w:space="0" w:val="none" w:sz="0"/>
+        <w:insideH w:color="auto" w:space="0" w:val="none" w:sz="0"/>
+        <w:insideV w:color="auto" w:space="0" w:val="none" w:sz="0"/>
       </w:tblBorders>
       <w:tblLayout w:type="fixed"/>
     </w:tblPr>
@@ -9939,7 +9939,7 @@
       <w:lvlText w:val="%1"/>
       <w:lvlJc w:val="left"/>
       <w:pPr>
-        <w:ind w:left="0" w:hanging="0"/>
+        <w:ind w:hanging="0" w:left="0"/>
       </w:pPr>
     </w:lvl>
     <w:lvl w:ilvl="1">
@@ -9951,7 +9951,7 @@
       <w:lvlText w:val="%1.%2"/>
       <w:lvlJc w:val="left"/>
       <w:pPr>
-        <w:ind w:left="0" w:hanging="0"/>
+        <w:ind w:hanging="0" w:left="0"/>
       </w:pPr>
     </w:lvl>
     <w:lvl w:ilvl="2">
@@ -9963,7 +9963,7 @@
       <w:lvlText w:val="%1.%2.%3"/>
       <w:lvlJc w:val="left"/>
       <w:pPr>
-        <w:ind w:left="0" w:hanging="0"/>
+        <w:ind w:hanging="0" w:left="0"/>
       </w:pPr>
     </w:lvl>
     <w:lvl w:ilvl="3">
@@ -9975,7 +9975,7 @@
       <w:lvlText w:val="%1.%2.%3.%4"/>
       <w:lvlJc w:val="left"/>
       <w:pPr>
-        <w:ind w:left="0" w:hanging="0"/>
+        <w:ind w:hanging="0" w:left="0"/>
       </w:pPr>
     </w:lvl>
     <w:lvl w:ilvl="4">
@@ -9987,7 +9987,7 @@
       <w:lvlText w:val="%1.%2.%3.%4.%5"/>
       <w:lvlJc w:val="left"/>
       <w:pPr>
-        <w:ind w:left="0" w:hanging="0"/>
+        <w:ind w:hanging="0" w:left="0"/>
       </w:pPr>
     </w:lvl>
   </w:abstractNum>
@@ -11168,18 +11168,18 @@
     <w:basedOn w:val="VerbatimChar"/>
     <w:rPr/>
   </w:style>
-  <w:style w:styleId="SpecObjectHeader" w:customStyle="1" w:type="paragraph">
+  <w:style w:type="paragraph" w:customStyle="1" w:styleId="SpecObjectHeader">
     <w:name w:val="Spec Object Header"/>
     <w:basedOn w:val="Normal"/>
     <w:next w:val="FirstParagraph"/>
     <w:qFormat/>
     <w:pPr>
       <w:keepNext/>
-      <w:spacing w:lineRule="auto" w:before="280" w:line="276" w:after="120"/>
+      <w:spacing w:line="276" w:lineRule="auto" w:before="280" w:after="120"/>
       <w:outlineLvl w:val="0"/>
     </w:pPr>
     <w:rPr>
-      <w:rFonts w:hAnsi="Calibri Light" w:ascii="Calibri Light" w:cs="Calibri Light"/>
+      <w:rFonts w:cs="Calibri Light" w:ascii="Calibri Light" w:hAnsi="Calibri Light"/>
       <w:b/>
       <w:bCs/>
       <w:color w:val="0F4C64"/>

</xml_diff>

<commit_message>
Deploy documentation from v0.7
</commit_message>
<xml_diff>
--- a/commonspec/downloads/commonspec.docx
+++ b/commonspec/downloads/commonspec.docx
@@ -16,7 +16,7 @@
       <w:pPr>
         <w:pStyle w:val="TOCHeading"/>
       </w:pPr>
-      <w:bookmarkStart w:id="28179" w:name="SPEC-sec1"/>
+      <w:bookmarkStart w:name="SPEC-sec1" w:id="28179"/>
       <w:r>
         <w:rPr>
           <w:color w:val="000000"/>
@@ -1688,12 +1688,12 @@
     </w:p>
     <w:p>
       <w:pPr>
-        <w:spacing w:lineRule="exact" w:after="0" w:before="0" w:line="20"/>
+        <w:spacing w:lineRule="exact" w:line="20" w:after="0" w:before="0"/>
         <w:rPr>
           <w:sz w:val="2"/>
         </w:rPr>
       </w:pPr>
-      <w:bookmarkStart w:id="36907" w:name="puml-grammar-spec"/>
+      <w:bookmarkStart w:name="puml-grammar-spec" w:id="36907"/>
       <w:bookmarkEnd w:id="36907"/>
     </w:p>
     <w:p>
@@ -2396,12 +2396,12 @@
     </w:p>
     <w:p>
       <w:pPr>
-        <w:spacing w:lineRule="exact" w:after="0" w:before="0" w:line="20"/>
+        <w:spacing w:lineRule="exact" w:line="20" w:after="0" w:before="0"/>
         <w:rPr>
           <w:sz w:val="2"/>
         </w:rPr>
       </w:pPr>
-      <w:bookmarkStart w:id="45123" w:name="puml-grammar-spec-object"/>
+      <w:bookmarkStart w:name="puml-grammar-spec-object" w:id="45123"/>
       <w:bookmarkEnd w:id="45123"/>
     </w:p>
     <w:p>
@@ -3370,12 +3370,12 @@
     </w:p>
     <w:p>
       <w:pPr>
-        <w:spacing w:lineRule="exact" w:after="0" w:before="0" w:line="20"/>
+        <w:spacing w:lineRule="exact" w:line="20" w:after="0" w:before="0"/>
         <w:rPr>
           <w:sz w:val="2"/>
         </w:rPr>
       </w:pPr>
-      <w:bookmarkStart w:id="89146" w:name="puml-grammar-spec-float"/>
+      <w:bookmarkStart w:name="puml-grammar-spec-float" w:id="89146"/>
       <w:bookmarkEnd w:id="89146"/>
     </w:p>
     <w:p>
@@ -4312,12 +4312,12 @@
     </w:p>
     <w:p>
       <w:pPr>
-        <w:spacing w:lineRule="exact" w:after="0" w:before="0" w:line="20"/>
+        <w:spacing w:lineRule="exact" w:line="20" w:after="0" w:before="0"/>
         <w:rPr>
           <w:sz w:val="2"/>
         </w:rPr>
       </w:pPr>
-      <w:bookmarkStart w:id="27150" w:name="puml-grammar-attribute"/>
+      <w:bookmarkStart w:name="puml-grammar-attribute" w:id="27150"/>
       <w:bookmarkEnd w:id="27150"/>
     </w:p>
     <w:p>
@@ -5458,12 +5458,12 @@
     </w:p>
     <w:p>
       <w:pPr>
-        <w:spacing w:lineRule="exact" w:after="0" w:before="0" w:line="20"/>
+        <w:spacing w:lineRule="exact" w:line="20" w:after="0" w:before="0"/>
         <w:rPr>
           <w:sz w:val="2"/>
         </w:rPr>
       </w:pPr>
-      <w:bookmarkStart w:id="79264" w:name="puml-grammar-spec-relation"/>
+      <w:bookmarkStart w:name="puml-grammar-spec-relation" w:id="79264"/>
       <w:bookmarkEnd w:id="79264"/>
     </w:p>
     <w:p>
@@ -6232,18 +6232,18 @@
         <w:tblLook w:firstRow="1" w:lastRow="0" w:firstColumn="0" w:lastColumn="0" w:noHBand="0" w:noVBand="0" w:val="0020"/>
         <w:jc w:val="start"/>
         <w:tblBorders>
-          <w:top w:val="single" w:space="0" w:color="000000" w:sz="6"/>
-          <w:left w:val="single" w:space="0" w:color="000000" w:sz="6"/>
-          <w:bottom w:val="single" w:space="0" w:color="000000" w:sz="6"/>
-          <w:right w:val="single" w:space="0" w:color="000000" w:sz="6"/>
-          <w:insideH w:val="single" w:space="0" w:color="000000" w:sz="6"/>
-          <w:insideV w:val="single" w:space="0" w:color="000000" w:sz="6"/>
+          <w:top w:sz="6" w:space="0" w:color="000000" w:val="single"/>
+          <w:left w:sz="6" w:space="0" w:color="000000" w:val="single"/>
+          <w:bottom w:sz="6" w:space="0" w:color="000000" w:val="single"/>
+          <w:right w:sz="6" w:space="0" w:color="000000" w:val="single"/>
+          <w:insideH w:sz="6" w:space="0" w:color="000000" w:val="single"/>
+          <w:insideV w:sz="6" w:space="0" w:color="000000" w:val="single"/>
         </w:tblBorders>
         <w:tblCellMar>
-          <w:top w:type="dxa" w:w="57"/>
-          <w:left w:type="dxa" w:w="108"/>
-          <w:bottom w:type="dxa" w:w="57"/>
-          <w:right w:type="dxa" w:w="108"/>
+          <w:top w:w="57" w:type="dxa"/>
+          <w:left w:w="108" w:type="dxa"/>
+          <w:bottom w:w="57" w:type="dxa"/>
+          <w:right w:w="108" w:type="dxa"/>
         </w:tblCellMar>
       </w:tblPr>
       <w:tblGrid>
@@ -6260,14 +6260,14 @@
         </w:trPr>
         <w:tc>
           <w:tcPr>
-            <w:shd w:val="clear" w:fill="E8E8E8" w:color="auto"/>
+            <w:shd w:fill="E8E8E8" w:color="auto" w:val="clear"/>
           </w:tcPr>
           <w:p>
             <w:pPr>
               <w:pStyle w:val="Compact"/>
               <w:jc w:val="left"/>
-              <w:ind w:firstLine="0" w:right="0" w:left="0"/>
-              <w:spacing w:line="240" w:before="40" w:after="40" w:lineRule="auto"/>
+              <w:ind w:right="0" w:firstLine="0" w:left="0"/>
+              <w:spacing w:before="40" w:lineRule="auto" w:line="240" w:after="40"/>
             </w:pPr>
             <w:r>
               <w:rPr>
@@ -6279,14 +6279,14 @@
         </w:tc>
         <w:tc>
           <w:tcPr>
-            <w:shd w:val="clear" w:fill="E8E8E8" w:color="auto"/>
+            <w:shd w:fill="E8E8E8" w:color="auto" w:val="clear"/>
           </w:tcPr>
           <w:p>
             <w:pPr>
               <w:pStyle w:val="Compact"/>
               <w:jc w:val="left"/>
-              <w:ind w:firstLine="0" w:right="0" w:left="0"/>
-              <w:spacing w:line="240" w:before="40" w:after="40" w:lineRule="auto"/>
+              <w:ind w:right="0" w:firstLine="0" w:left="0"/>
+              <w:spacing w:before="40" w:lineRule="auto" w:line="240" w:after="40"/>
             </w:pPr>
             <w:r>
               <w:rPr>
@@ -6298,14 +6298,14 @@
         </w:tc>
         <w:tc>
           <w:tcPr>
-            <w:shd w:val="clear" w:fill="E8E8E8" w:color="auto"/>
+            <w:shd w:fill="E8E8E8" w:color="auto" w:val="clear"/>
           </w:tcPr>
           <w:p>
             <w:pPr>
               <w:pStyle w:val="Compact"/>
               <w:jc w:val="left"/>
-              <w:ind w:firstLine="0" w:right="0" w:left="0"/>
-              <w:spacing w:line="240" w:before="40" w:after="40" w:lineRule="auto"/>
+              <w:ind w:right="0" w:firstLine="0" w:left="0"/>
+              <w:spacing w:before="40" w:lineRule="auto" w:line="240" w:after="40"/>
             </w:pPr>
             <w:r>
               <w:rPr>
@@ -6317,14 +6317,14 @@
         </w:tc>
         <w:tc>
           <w:tcPr>
-            <w:shd w:val="clear" w:fill="E8E8E8" w:color="auto"/>
+            <w:shd w:fill="E8E8E8" w:color="auto" w:val="clear"/>
           </w:tcPr>
           <w:p>
             <w:pPr>
               <w:pStyle w:val="Compact"/>
               <w:jc w:val="left"/>
-              <w:ind w:firstLine="0" w:right="0" w:left="0"/>
-              <w:spacing w:line="240" w:before="40" w:after="40" w:lineRule="auto"/>
+              <w:ind w:right="0" w:firstLine="0" w:left="0"/>
+              <w:spacing w:before="40" w:lineRule="auto" w:line="240" w:after="40"/>
             </w:pPr>
             <w:r>
               <w:rPr>
@@ -6336,14 +6336,14 @@
         </w:tc>
         <w:tc>
           <w:tcPr>
-            <w:shd w:val="clear" w:fill="E8E8E8" w:color="auto"/>
+            <w:shd w:fill="E8E8E8" w:color="auto" w:val="clear"/>
           </w:tcPr>
           <w:p>
             <w:pPr>
               <w:pStyle w:val="Compact"/>
               <w:jc w:val="left"/>
-              <w:ind w:firstLine="0" w:right="0" w:left="0"/>
-              <w:spacing w:line="240" w:before="40" w:after="40" w:lineRule="auto"/>
+              <w:ind w:right="0" w:firstLine="0" w:left="0"/>
+              <w:spacing w:before="40" w:lineRule="auto" w:line="240" w:after="40"/>
             </w:pPr>
             <w:r>
               <w:rPr>
@@ -6355,14 +6355,14 @@
         </w:tc>
         <w:tc>
           <w:tcPr>
-            <w:shd w:val="clear" w:fill="E8E8E8" w:color="auto"/>
+            <w:shd w:fill="E8E8E8" w:color="auto" w:val="clear"/>
           </w:tcPr>
           <w:p>
             <w:pPr>
               <w:pStyle w:val="Compact"/>
               <w:jc w:val="left"/>
-              <w:ind w:firstLine="0" w:right="0" w:left="0"/>
-              <w:spacing w:line="240" w:before="40" w:after="40" w:lineRule="auto"/>
+              <w:ind w:right="0" w:firstLine="0" w:left="0"/>
+              <w:spacing w:before="40" w:lineRule="auto" w:line="240" w:after="40"/>
             </w:pPr>
             <w:r>
               <w:rPr>
@@ -6380,8 +6380,8 @@
             <w:pPr>
               <w:pStyle w:val="Compact"/>
               <w:jc w:val="left"/>
-              <w:ind w:firstLine="0" w:right="0" w:left="0"/>
-              <w:spacing w:line="240" w:before="40" w:after="40" w:lineRule="auto"/>
+              <w:ind w:right="0" w:firstLine="0" w:left="0"/>
+              <w:spacing w:before="40" w:lineRule="auto" w:line="240" w:after="40"/>
             </w:pPr>
             <w:r>
               <w:t xml:space="preserve">VERIFIES</w:t>
@@ -6394,8 +6394,8 @@
             <w:pPr>
               <w:pStyle w:val="Compact"/>
               <w:jc w:val="left"/>
-              <w:ind w:firstLine="0" w:right="0" w:left="0"/>
-              <w:spacing w:line="240" w:before="40" w:after="40" w:lineRule="auto"/>
+              <w:ind w:right="0" w:firstLine="0" w:left="0"/>
+              <w:spacing w:before="40" w:lineRule="auto" w:line="240" w:after="40"/>
             </w:pPr>
             <w:r>
               <w:rPr>
@@ -6411,8 +6411,8 @@
             <w:pPr>
               <w:pStyle w:val="Compact"/>
               <w:jc w:val="left"/>
-              <w:ind w:firstLine="0" w:right="0" w:left="0"/>
-              <w:spacing w:line="240" w:before="40" w:after="40" w:lineRule="auto"/>
+              <w:ind w:right="0" w:firstLine="0" w:left="0"/>
+              <w:spacing w:before="40" w:lineRule="auto" w:line="240" w:after="40"/>
             </w:pPr>
             <w:r>
               <w:rPr>
@@ -6428,8 +6428,8 @@
             <w:pPr>
               <w:pStyle w:val="Compact"/>
               <w:jc w:val="left"/>
-              <w:ind w:firstLine="0" w:right="0" w:left="0"/>
-              <w:spacing w:line="240" w:before="40" w:after="40" w:lineRule="auto"/>
+              <w:ind w:right="0" w:firstLine="0" w:left="0"/>
+              <w:spacing w:before="40" w:lineRule="auto" w:line="240" w:after="40"/>
             </w:pPr>
             <w:r>
               <w:rPr>
@@ -6445,8 +6445,8 @@
             <w:pPr>
               <w:pStyle w:val="Compact"/>
               <w:jc w:val="left"/>
-              <w:ind w:firstLine="0" w:right="0" w:left="0"/>
-              <w:spacing w:line="240" w:before="40" w:after="40" w:lineRule="auto"/>
+              <w:ind w:right="0" w:firstLine="0" w:left="0"/>
+              <w:spacing w:before="40" w:lineRule="auto" w:line="240" w:after="40"/>
             </w:pPr>
             <w:r>
               <w:rPr>
@@ -6462,8 +6462,8 @@
             <w:pPr>
               <w:pStyle w:val="Compact"/>
               <w:jc w:val="left"/>
-              <w:ind w:firstLine="0" w:right="0" w:left="0"/>
-              <w:spacing w:line="240" w:before="40" w:after="40" w:lineRule="auto"/>
+              <w:ind w:right="0" w:firstLine="0" w:left="0"/>
+              <w:spacing w:before="40" w:lineRule="auto" w:line="240" w:after="40"/>
             </w:pPr>
             <w:r>
               <w:rPr>
@@ -6482,8 +6482,8 @@
             <w:pPr>
               <w:pStyle w:val="Compact"/>
               <w:jc w:val="left"/>
-              <w:ind w:firstLine="0" w:right="0" w:left="0"/>
-              <w:spacing w:line="240" w:before="40" w:after="40" w:lineRule="auto"/>
+              <w:ind w:right="0" w:firstLine="0" w:left="0"/>
+              <w:spacing w:before="40" w:lineRule="auto" w:line="240" w:after="40"/>
             </w:pPr>
             <w:r>
               <w:t xml:space="preserve">TRACES_TO</w:t>
@@ -6496,8 +6496,8 @@
             <w:pPr>
               <w:pStyle w:val="Compact"/>
               <w:jc w:val="left"/>
-              <w:ind w:firstLine="0" w:right="0" w:left="0"/>
-              <w:spacing w:line="240" w:before="40" w:after="40" w:lineRule="auto"/>
+              <w:ind w:right="0" w:firstLine="0" w:left="0"/>
+              <w:spacing w:before="40" w:lineRule="auto" w:line="240" w:after="40"/>
             </w:pPr>
             <w:r>
               <w:rPr>
@@ -6513,8 +6513,8 @@
             <w:pPr>
               <w:pStyle w:val="Compact"/>
               <w:jc w:val="left"/>
-              <w:ind w:firstLine="0" w:right="0" w:left="0"/>
-              <w:spacing w:line="240" w:before="40" w:after="40" w:lineRule="auto"/>
+              <w:ind w:right="0" w:firstLine="0" w:left="0"/>
+              <w:spacing w:before="40" w:lineRule="auto" w:line="240" w:after="40"/>
             </w:pPr>
             <w:r>
               <w:t xml:space="preserve">—</w:t>
@@ -6527,8 +6527,8 @@
             <w:pPr>
               <w:pStyle w:val="Compact"/>
               <w:jc w:val="left"/>
-              <w:ind w:firstLine="0" w:right="0" w:left="0"/>
-              <w:spacing w:line="240" w:before="40" w:after="40" w:lineRule="auto"/>
+              <w:ind w:right="0" w:firstLine="0" w:left="0"/>
+              <w:spacing w:before="40" w:lineRule="auto" w:line="240" w:after="40"/>
             </w:pPr>
             <w:r>
               <w:t xml:space="preserve">—</w:t>
@@ -6541,8 +6541,8 @@
             <w:pPr>
               <w:pStyle w:val="Compact"/>
               <w:jc w:val="left"/>
-              <w:ind w:firstLine="0" w:right="0" w:left="0"/>
-              <w:spacing w:line="240" w:before="40" w:after="40" w:lineRule="auto"/>
+              <w:ind w:right="0" w:firstLine="0" w:left="0"/>
+              <w:spacing w:before="40" w:lineRule="auto" w:line="240" w:after="40"/>
             </w:pPr>
             <w:r>
               <w:t xml:space="preserve">—</w:t>
@@ -6555,8 +6555,8 @@
             <w:pPr>
               <w:pStyle w:val="Compact"/>
               <w:jc w:val="left"/>
-              <w:ind w:firstLine="0" w:right="0" w:left="0"/>
-              <w:spacing w:line="240" w:before="40" w:after="40" w:lineRule="auto"/>
+              <w:ind w:right="0" w:firstLine="0" w:left="0"/>
+              <w:spacing w:before="40" w:lineRule="auto" w:line="240" w:after="40"/>
             </w:pPr>
             <w:r>
               <w:t xml:space="preserve">1</w:t>
@@ -6571,8 +6571,8 @@
             <w:pPr>
               <w:pStyle w:val="Compact"/>
               <w:jc w:val="left"/>
-              <w:ind w:firstLine="0" w:right="0" w:left="0"/>
-              <w:spacing w:line="240" w:before="40" w:after="40" w:lineRule="auto"/>
+              <w:ind w:right="0" w:firstLine="0" w:left="0"/>
+              <w:spacing w:before="40" w:lineRule="auto" w:line="240" w:after="40"/>
             </w:pPr>
             <w:r>
               <w:t xml:space="preserve">XREF_SEC</w:t>
@@ -6585,8 +6585,8 @@
             <w:pPr>
               <w:pStyle w:val="Compact"/>
               <w:jc w:val="left"/>
-              <w:ind w:firstLine="0" w:right="0" w:left="0"/>
-              <w:spacing w:line="240" w:before="40" w:after="40" w:lineRule="auto"/>
+              <w:ind w:right="0" w:firstLine="0" w:left="0"/>
+              <w:spacing w:before="40" w:lineRule="auto" w:line="240" w:after="40"/>
             </w:pPr>
             <w:r>
               <w:rPr>
@@ -6602,8 +6602,8 @@
             <w:pPr>
               <w:pStyle w:val="Compact"/>
               <w:jc w:val="left"/>
-              <w:ind w:firstLine="0" w:right="0" w:left="0"/>
-              <w:spacing w:line="240" w:before="40" w:after="40" w:lineRule="auto"/>
+              <w:ind w:right="0" w:firstLine="0" w:left="0"/>
+              <w:spacing w:before="40" w:lineRule="auto" w:line="240" w:after="40"/>
             </w:pPr>
             <w:r>
               <w:t xml:space="preserve">—</w:t>
@@ -6616,8 +6616,8 @@
             <w:pPr>
               <w:pStyle w:val="Compact"/>
               <w:jc w:val="left"/>
-              <w:ind w:firstLine="0" w:right="0" w:left="0"/>
-              <w:spacing w:line="240" w:before="40" w:after="40" w:lineRule="auto"/>
+              <w:ind w:right="0" w:firstLine="0" w:left="0"/>
+              <w:spacing w:before="40" w:lineRule="auto" w:line="240" w:after="40"/>
             </w:pPr>
             <w:r>
               <w:t xml:space="preserve">—</w:t>
@@ -6630,8 +6630,8 @@
             <w:pPr>
               <w:pStyle w:val="Compact"/>
               <w:jc w:val="left"/>
-              <w:ind w:firstLine="0" w:right="0" w:left="0"/>
-              <w:spacing w:line="240" w:before="40" w:after="40" w:lineRule="auto"/>
+              <w:ind w:right="0" w:firstLine="0" w:left="0"/>
+              <w:spacing w:before="40" w:lineRule="auto" w:line="240" w:after="40"/>
             </w:pPr>
             <w:r>
               <w:rPr>
@@ -6648,8 +6648,8 @@
             <w:pPr>
               <w:pStyle w:val="Compact"/>
               <w:jc w:val="left"/>
-              <w:ind w:firstLine="0" w:right="0" w:left="0"/>
-              <w:spacing w:line="240" w:before="40" w:after="40" w:lineRule="auto"/>
+              <w:ind w:right="0" w:firstLine="0" w:left="0"/>
+              <w:spacing w:before="40" w:lineRule="auto" w:line="240" w:after="40"/>
             </w:pPr>
             <w:r>
               <w:t xml:space="preserve">eliminated</w:t>
@@ -7265,12 +7265,12 @@
     </w:p>
     <w:p>
       <w:pPr>
-        <w:spacing w:lineRule="exact" w:after="0" w:before="0" w:line="20"/>
+        <w:spacing w:lineRule="exact" w:line="20" w:after="0" w:before="0"/>
         <w:rPr>
           <w:sz w:val="2"/>
         </w:rPr>
       </w:pPr>
-      <w:bookmarkStart w:id="24745" w:name="puml-grammar-spec-view"/>
+      <w:bookmarkStart w:name="puml-grammar-spec-view" w:id="24745"/>
       <w:bookmarkEnd w:id="24745"/>
     </w:p>
     <w:p>
@@ -8163,12 +8163,12 @@
     </w:p>
     <w:p>
       <w:pPr>
-        <w:spacing w:lineRule="exact" w:after="0" w:before="0" w:line="20"/>
+        <w:spacing w:lineRule="exact" w:line="20" w:after="0" w:before="0"/>
         <w:rPr>
           <w:sz w:val="2"/>
         </w:rPr>
       </w:pPr>
-      <w:bookmarkStart w:id="65281" w:name="csv-tbl-diagram-link-scan"/>
+      <w:bookmarkStart w:name="csv-tbl-diagram-link-scan" w:id="65281"/>
       <w:bookmarkEnd w:id="65281"/>
     </w:p>
     <w:p>
@@ -8205,18 +8205,18 @@
         <w:tblLook w:firstRow="1" w:lastRow="0" w:firstColumn="0" w:lastColumn="0" w:noHBand="0" w:noVBand="0" w:val="0020"/>
         <w:jc w:val="start"/>
         <w:tblBorders>
-          <w:top w:val="single" w:space="0" w:color="000000" w:sz="6"/>
-          <w:left w:val="single" w:space="0" w:color="000000" w:sz="6"/>
-          <w:bottom w:val="single" w:space="0" w:color="000000" w:sz="6"/>
-          <w:right w:val="single" w:space="0" w:color="000000" w:sz="6"/>
-          <w:insideH w:val="single" w:space="0" w:color="000000" w:sz="6"/>
-          <w:insideV w:val="single" w:space="0" w:color="000000" w:sz="6"/>
+          <w:top w:sz="6" w:space="0" w:color="000000" w:val="single"/>
+          <w:left w:sz="6" w:space="0" w:color="000000" w:val="single"/>
+          <w:bottom w:sz="6" w:space="0" w:color="000000" w:val="single"/>
+          <w:right w:sz="6" w:space="0" w:color="000000" w:val="single"/>
+          <w:insideH w:sz="6" w:space="0" w:color="000000" w:val="single"/>
+          <w:insideV w:sz="6" w:space="0" w:color="000000" w:val="single"/>
         </w:tblBorders>
         <w:tblCellMar>
-          <w:top w:type="dxa" w:w="57"/>
-          <w:left w:type="dxa" w:w="108"/>
-          <w:bottom w:type="dxa" w:w="57"/>
-          <w:right w:type="dxa" w:w="108"/>
+          <w:top w:w="57" w:type="dxa"/>
+          <w:left w:w="108" w:type="dxa"/>
+          <w:bottom w:w="57" w:type="dxa"/>
+          <w:right w:w="108" w:type="dxa"/>
         </w:tblCellMar>
       </w:tblPr>
       <w:tblGrid>
@@ -8230,14 +8230,14 @@
         </w:trPr>
         <w:tc>
           <w:tcPr>
-            <w:shd w:val="clear" w:fill="E8E8E8" w:color="auto"/>
+            <w:shd w:fill="E8E8E8" w:color="auto" w:val="clear"/>
           </w:tcPr>
           <w:p>
             <w:pPr>
               <w:pStyle w:val="Compact"/>
               <w:jc w:val="left"/>
-              <w:ind w:firstLine="0" w:right="0" w:left="0"/>
-              <w:spacing w:line="240" w:before="40" w:after="40" w:lineRule="auto"/>
+              <w:ind w:right="0" w:firstLine="0" w:left="0"/>
+              <w:spacing w:before="40" w:lineRule="auto" w:line="240" w:after="40"/>
             </w:pPr>
             <w:r>
               <w:rPr>
@@ -8249,14 +8249,14 @@
         </w:tc>
         <w:tc>
           <w:tcPr>
-            <w:shd w:val="clear" w:fill="E8E8E8" w:color="auto"/>
+            <w:shd w:fill="E8E8E8" w:color="auto" w:val="clear"/>
           </w:tcPr>
           <w:p>
             <w:pPr>
               <w:pStyle w:val="Compact"/>
               <w:jc w:val="left"/>
-              <w:ind w:firstLine="0" w:right="0" w:left="0"/>
-              <w:spacing w:line="240" w:before="40" w:after="40" w:lineRule="auto"/>
+              <w:ind w:right="0" w:firstLine="0" w:left="0"/>
+              <w:spacing w:before="40" w:lineRule="auto" w:line="240" w:after="40"/>
             </w:pPr>
             <w:r>
               <w:rPr>
@@ -8268,14 +8268,14 @@
         </w:tc>
         <w:tc>
           <w:tcPr>
-            <w:shd w:val="clear" w:fill="E8E8E8" w:color="auto"/>
+            <w:shd w:fill="E8E8E8" w:color="auto" w:val="clear"/>
           </w:tcPr>
           <w:p>
             <w:pPr>
               <w:pStyle w:val="Compact"/>
               <w:jc w:val="left"/>
-              <w:ind w:firstLine="0" w:right="0" w:left="0"/>
-              <w:spacing w:line="240" w:before="40" w:after="40" w:lineRule="auto"/>
+              <w:ind w:right="0" w:firstLine="0" w:left="0"/>
+              <w:spacing w:before="40" w:lineRule="auto" w:line="240" w:after="40"/>
             </w:pPr>
             <w:r>
               <w:rPr>
@@ -8293,8 +8293,8 @@
             <w:pPr>
               <w:pStyle w:val="Compact"/>
               <w:jc w:val="left"/>
-              <w:ind w:firstLine="0" w:right="0" w:left="0"/>
-              <w:spacing w:line="240" w:before="40" w:after="40" w:lineRule="auto"/>
+              <w:ind w:right="0" w:firstLine="0" w:left="0"/>
+              <w:spacing w:before="40" w:lineRule="auto" w:line="240" w:after="40"/>
             </w:pPr>
             <w:r>
               <w:rPr>
@@ -8310,8 +8310,8 @@
             <w:pPr>
               <w:pStyle w:val="Compact"/>
               <w:jc w:val="left"/>
-              <w:ind w:firstLine="0" w:right="0" w:left="0"/>
-              <w:spacing w:line="240" w:before="40" w:after="40" w:lineRule="auto"/>
+              <w:ind w:right="0" w:firstLine="0" w:left="0"/>
+              <w:spacing w:before="40" w:lineRule="auto" w:line="240" w:after="40"/>
             </w:pPr>
             <w:r>
               <w:t xml:space="preserve">Yes</w:t>
@@ -8324,8 +8324,8 @@
             <w:pPr>
               <w:pStyle w:val="Compact"/>
               <w:jc w:val="left"/>
-              <w:ind w:firstLine="0" w:right="0" w:left="0"/>
-              <w:spacing w:line="240" w:before="40" w:after="40" w:lineRule="auto"/>
+              <w:ind w:right="0" w:firstLine="0" w:left="0"/>
+              <w:spacing w:before="40" w:lineRule="auto" w:line="240" w:after="40"/>
             </w:pPr>
             <w:r>
               <w:t xml:space="preserve">Text without brackets, selector</w:t>
@@ -8349,8 +8349,8 @@
             <w:pPr>
               <w:pStyle w:val="Compact"/>
               <w:jc w:val="left"/>
-              <w:ind w:firstLine="0" w:right="0" w:left="0"/>
-              <w:spacing w:line="240" w:before="40" w:after="40" w:lineRule="auto"/>
+              <w:ind w:right="0" w:firstLine="0" w:left="0"/>
+              <w:spacing w:before="40" w:lineRule="auto" w:line="240" w:after="40"/>
             </w:pPr>
             <w:r>
               <w:rPr>
@@ -8366,8 +8366,8 @@
             <w:pPr>
               <w:pStyle w:val="Compact"/>
               <w:jc w:val="left"/>
-              <w:ind w:firstLine="0" w:right="0" w:left="0"/>
-              <w:spacing w:line="240" w:before="40" w:after="40" w:lineRule="auto"/>
+              <w:ind w:right="0" w:firstLine="0" w:left="0"/>
+              <w:spacing w:before="40" w:lineRule="auto" w:line="240" w:after="40"/>
             </w:pPr>
             <w:r>
               <w:t xml:space="preserve">Yes</w:t>
@@ -8380,8 +8380,8 @@
             <w:pPr>
               <w:pStyle w:val="Compact"/>
               <w:jc w:val="left"/>
-              <w:ind w:firstLine="0" w:right="0" w:left="0"/>
-              <w:spacing w:line="240" w:before="40" w:after="40" w:lineRule="auto"/>
+              <w:ind w:right="0" w:firstLine="0" w:left="0"/>
+              <w:spacing w:before="40" w:lineRule="auto" w:line="240" w:after="40"/>
             </w:pPr>
             <w:r>
               <w:t xml:space="preserve">Text without brackets, selector</w:t>
@@ -8405,8 +8405,8 @@
             <w:pPr>
               <w:pStyle w:val="Compact"/>
               <w:jc w:val="left"/>
-              <w:ind w:firstLine="0" w:right="0" w:left="0"/>
-              <w:spacing w:line="240" w:before="40" w:after="40" w:lineRule="auto"/>
+              <w:ind w:right="0" w:firstLine="0" w:left="0"/>
+              <w:spacing w:before="40" w:lineRule="auto" w:line="240" w:after="40"/>
             </w:pPr>
             <w:r>
               <w:rPr>
@@ -8422,8 +8422,8 @@
             <w:pPr>
               <w:pStyle w:val="Compact"/>
               <w:jc w:val="left"/>
-              <w:ind w:firstLine="0" w:right="0" w:left="0"/>
-              <w:spacing w:line="240" w:before="40" w:after="40" w:lineRule="auto"/>
+              <w:ind w:right="0" w:firstLine="0" w:left="0"/>
+              <w:spacing w:before="40" w:lineRule="auto" w:line="240" w:after="40"/>
             </w:pPr>
             <w:r>
               <w:t xml:space="preserve">No</w:t>
@@ -8436,8 +8436,8 @@
             <w:pPr>
               <w:pStyle w:val="Compact"/>
               <w:jc w:val="left"/>
-              <w:ind w:firstLine="0" w:right="0" w:left="0"/>
-              <w:spacing w:line="240" w:before="40" w:after="40" w:lineRule="auto"/>
+              <w:ind w:right="0" w:firstLine="0" w:left="0"/>
+              <w:spacing w:before="40" w:lineRule="auto" w:line="240" w:after="40"/>
             </w:pPr>
             <w:r>
               <w:t xml:space="preserve">No</w:t>
@@ -8467,8 +8467,8 @@
             <w:pPr>
               <w:pStyle w:val="Compact"/>
               <w:jc w:val="left"/>
-              <w:ind w:firstLine="0" w:right="0" w:left="0"/>
-              <w:spacing w:line="240" w:before="40" w:after="40" w:lineRule="auto"/>
+              <w:ind w:right="0" w:firstLine="0" w:left="0"/>
+              <w:spacing w:before="40" w:lineRule="auto" w:line="240" w:after="40"/>
             </w:pPr>
             <w:r>
               <w:rPr>
@@ -8484,8 +8484,8 @@
             <w:pPr>
               <w:pStyle w:val="Compact"/>
               <w:jc w:val="left"/>
-              <w:ind w:firstLine="0" w:right="0" w:left="0"/>
-              <w:spacing w:line="240" w:before="40" w:after="40" w:lineRule="auto"/>
+              <w:ind w:right="0" w:firstLine="0" w:left="0"/>
+              <w:spacing w:before="40" w:lineRule="auto" w:line="240" w:after="40"/>
             </w:pPr>
             <w:r>
               <w:t xml:space="preserve">No</w:t>
@@ -8498,8 +8498,8 @@
             <w:pPr>
               <w:pStyle w:val="Compact"/>
               <w:jc w:val="left"/>
-              <w:ind w:firstLine="0" w:right="0" w:left="0"/>
-              <w:spacing w:line="240" w:before="40" w:after="40" w:lineRule="auto"/>
+              <w:ind w:right="0" w:firstLine="0" w:left="0"/>
+              <w:spacing w:before="40" w:lineRule="auto" w:line="240" w:after="40"/>
             </w:pPr>
             <w:r>
               <w:t xml:space="preserve">Text contains</w:t>
@@ -8541,8 +8541,8 @@
             <w:pPr>
               <w:pStyle w:val="Compact"/>
               <w:jc w:val="left"/>
-              <w:ind w:firstLine="0" w:right="0" w:left="0"/>
-              <w:spacing w:line="240" w:before="40" w:after="40" w:lineRule="auto"/>
+              <w:ind w:right="0" w:firstLine="0" w:left="0"/>
+              <w:spacing w:before="40" w:lineRule="auto" w:line="240" w:after="40"/>
             </w:pPr>
             <w:r>
               <w:rPr>
@@ -8558,8 +8558,8 @@
             <w:pPr>
               <w:pStyle w:val="Compact"/>
               <w:jc w:val="left"/>
-              <w:ind w:firstLine="0" w:right="0" w:left="0"/>
-              <w:spacing w:line="240" w:before="40" w:after="40" w:lineRule="auto"/>
+              <w:ind w:right="0" w:firstLine="0" w:left="0"/>
+              <w:spacing w:before="40" w:lineRule="auto" w:line="240" w:after="40"/>
             </w:pPr>
             <w:r>
               <w:t xml:space="preserve">No</w:t>
@@ -8572,8 +8572,8 @@
             <w:pPr>
               <w:pStyle w:val="Compact"/>
               <w:jc w:val="left"/>
-              <w:ind w:firstLine="0" w:right="0" w:left="0"/>
-              <w:spacing w:line="240" w:before="40" w:after="40" w:lineRule="auto"/>
+              <w:ind w:right="0" w:firstLine="0" w:left="0"/>
+              <w:spacing w:before="40" w:lineRule="auto" w:line="240" w:after="40"/>
             </w:pPr>
             <w:r>
               <w:rPr>
@@ -8597,8 +8597,8 @@
             <w:pPr>
               <w:pStyle w:val="Compact"/>
               <w:jc w:val="left"/>
-              <w:ind w:firstLine="0" w:right="0" w:left="0"/>
-              <w:spacing w:line="240" w:before="40" w:after="40" w:lineRule="auto"/>
+              <w:ind w:right="0" w:firstLine="0" w:left="0"/>
+              <w:spacing w:before="40" w:lineRule="auto" w:line="240" w:after="40"/>
             </w:pPr>
             <w:r>
               <w:rPr>
@@ -8614,8 +8614,8 @@
             <w:pPr>
               <w:pStyle w:val="Compact"/>
               <w:jc w:val="left"/>
-              <w:ind w:firstLine="0" w:right="0" w:left="0"/>
-              <w:spacing w:line="240" w:before="40" w:after="40" w:lineRule="auto"/>
+              <w:ind w:right="0" w:firstLine="0" w:left="0"/>
+              <w:spacing w:before="40" w:lineRule="auto" w:line="240" w:after="40"/>
             </w:pPr>
             <w:r>
               <w:t xml:space="preserve">No</w:t>
@@ -8628,8 +8628,8 @@
             <w:pPr>
               <w:pStyle w:val="Compact"/>
               <w:jc w:val="left"/>
-              <w:ind w:firstLine="0" w:right="0" w:left="0"/>
-              <w:spacing w:line="240" w:before="40" w:after="40" w:lineRule="auto"/>
+              <w:ind w:right="0" w:firstLine="0" w:left="0"/>
+              <w:spacing w:before="40" w:lineRule="auto" w:line="240" w:after="40"/>
             </w:pPr>
             <w:r>
               <w:t xml:space="preserve">Selector does not start with</w:t>
@@ -9799,12 +9799,12 @@
     </w:p>
     <w:p>
       <w:pPr>
-        <w:spacing w:lineRule="exact" w:after="0" w:before="0" w:line="20"/>
+        <w:spacing w:lineRule="exact" w:line="20" w:after="0" w:before="0"/>
         <w:rPr>
           <w:sz w:val="2"/>
         </w:rPr>
       </w:pPr>
-      <w:bookmarkStart w:id="46083" w:name="csv-primitive-datatypes"/>
+      <w:bookmarkStart w:name="csv-primitive-datatypes" w:id="46083"/>
       <w:bookmarkEnd w:id="46083"/>
     </w:p>
     <w:p>
@@ -9841,18 +9841,18 @@
         <w:tblLook w:firstRow="1" w:lastRow="0" w:firstColumn="0" w:lastColumn="0" w:noHBand="0" w:noVBand="0" w:val="0020"/>
         <w:jc w:val="start"/>
         <w:tblBorders>
-          <w:top w:val="single" w:space="0" w:color="000000" w:sz="6"/>
-          <w:left w:val="single" w:space="0" w:color="000000" w:sz="6"/>
-          <w:bottom w:val="single" w:space="0" w:color="000000" w:sz="6"/>
-          <w:right w:val="single" w:space="0" w:color="000000" w:sz="6"/>
-          <w:insideH w:val="single" w:space="0" w:color="000000" w:sz="6"/>
-          <w:insideV w:val="single" w:space="0" w:color="000000" w:sz="6"/>
+          <w:top w:sz="6" w:space="0" w:color="000000" w:val="single"/>
+          <w:left w:sz="6" w:space="0" w:color="000000" w:val="single"/>
+          <w:bottom w:sz="6" w:space="0" w:color="000000" w:val="single"/>
+          <w:right w:sz="6" w:space="0" w:color="000000" w:val="single"/>
+          <w:insideH w:sz="6" w:space="0" w:color="000000" w:val="single"/>
+          <w:insideV w:sz="6" w:space="0" w:color="000000" w:val="single"/>
         </w:tblBorders>
         <w:tblCellMar>
-          <w:top w:type="dxa" w:w="57"/>
-          <w:left w:type="dxa" w:w="108"/>
-          <w:bottom w:type="dxa" w:w="57"/>
-          <w:right w:type="dxa" w:w="108"/>
+          <w:top w:w="57" w:type="dxa"/>
+          <w:left w:w="108" w:type="dxa"/>
+          <w:bottom w:w="57" w:type="dxa"/>
+          <w:right w:w="108" w:type="dxa"/>
         </w:tblCellMar>
       </w:tblPr>
       <w:tblGrid>
@@ -9866,14 +9866,14 @@
         </w:trPr>
         <w:tc>
           <w:tcPr>
-            <w:shd w:val="clear" w:fill="E8E8E8" w:color="auto"/>
+            <w:shd w:fill="E8E8E8" w:color="auto" w:val="clear"/>
           </w:tcPr>
           <w:p>
             <w:pPr>
               <w:pStyle w:val="Compact"/>
               <w:jc w:val="left"/>
-              <w:ind w:firstLine="0" w:right="0" w:left="0"/>
-              <w:spacing w:line="240" w:before="40" w:after="40" w:lineRule="auto"/>
+              <w:ind w:right="0" w:firstLine="0" w:left="0"/>
+              <w:spacing w:before="40" w:lineRule="auto" w:line="240" w:after="40"/>
             </w:pPr>
             <w:r>
               <w:rPr>
@@ -9885,14 +9885,14 @@
         </w:tc>
         <w:tc>
           <w:tcPr>
-            <w:shd w:val="clear" w:fill="E8E8E8" w:color="auto"/>
+            <w:shd w:fill="E8E8E8" w:color="auto" w:val="clear"/>
           </w:tcPr>
           <w:p>
             <w:pPr>
               <w:pStyle w:val="Compact"/>
               <w:jc w:val="left"/>
-              <w:ind w:firstLine="0" w:right="0" w:left="0"/>
-              <w:spacing w:line="240" w:before="40" w:after="40" w:lineRule="auto"/>
+              <w:ind w:right="0" w:firstLine="0" w:left="0"/>
+              <w:spacing w:before="40" w:lineRule="auto" w:line="240" w:after="40"/>
             </w:pPr>
             <w:r>
               <w:rPr>
@@ -9904,14 +9904,14 @@
         </w:tc>
         <w:tc>
           <w:tcPr>
-            <w:shd w:val="clear" w:fill="E8E8E8" w:color="auto"/>
+            <w:shd w:fill="E8E8E8" w:color="auto" w:val="clear"/>
           </w:tcPr>
           <w:p>
             <w:pPr>
               <w:pStyle w:val="Compact"/>
               <w:jc w:val="left"/>
-              <w:ind w:firstLine="0" w:right="0" w:left="0"/>
-              <w:spacing w:line="240" w:before="40" w:after="40" w:lineRule="auto"/>
+              <w:ind w:right="0" w:firstLine="0" w:left="0"/>
+              <w:spacing w:before="40" w:lineRule="auto" w:line="240" w:after="40"/>
             </w:pPr>
             <w:r>
               <w:rPr>
@@ -9929,8 +9929,8 @@
             <w:pPr>
               <w:pStyle w:val="Compact"/>
               <w:jc w:val="left"/>
-              <w:ind w:firstLine="0" w:right="0" w:left="0"/>
-              <w:spacing w:line="240" w:before="40" w:after="40" w:lineRule="auto"/>
+              <w:ind w:right="0" w:firstLine="0" w:left="0"/>
+              <w:spacing w:before="40" w:lineRule="auto" w:line="240" w:after="40"/>
             </w:pPr>
             <w:r>
               <w:t xml:space="preserve">STRING</w:t>
@@ -9943,8 +9943,8 @@
             <w:pPr>
               <w:pStyle w:val="Compact"/>
               <w:jc w:val="left"/>
-              <w:ind w:firstLine="0" w:right="0" w:left="0"/>
-              <w:spacing w:line="240" w:before="40" w:after="40" w:lineRule="auto"/>
+              <w:ind w:right="0" w:firstLine="0" w:left="0"/>
+              <w:spacing w:before="40" w:lineRule="auto" w:line="240" w:after="40"/>
             </w:pPr>
             <w:r>
               <w:t xml:space="preserve">Plain text</w:t>
@@ -9957,8 +9957,8 @@
             <w:pPr>
               <w:pStyle w:val="Compact"/>
               <w:jc w:val="left"/>
-              <w:ind w:firstLine="0" w:right="0" w:left="0"/>
-              <w:spacing w:line="240" w:before="40" w:after="40" w:lineRule="auto"/>
+              <w:ind w:right="0" w:firstLine="0" w:left="0"/>
+              <w:spacing w:before="40" w:lineRule="auto" w:line="240" w:after="40"/>
             </w:pPr>
             <w:r>
               <w:t xml:space="preserve">Unformatted text value</w:t>
@@ -9973,8 +9973,8 @@
             <w:pPr>
               <w:pStyle w:val="Compact"/>
               <w:jc w:val="left"/>
-              <w:ind w:firstLine="0" w:right="0" w:left="0"/>
-              <w:spacing w:line="240" w:before="40" w:after="40" w:lineRule="auto"/>
+              <w:ind w:right="0" w:firstLine="0" w:left="0"/>
+              <w:spacing w:before="40" w:lineRule="auto" w:line="240" w:after="40"/>
             </w:pPr>
             <w:r>
               <w:t xml:space="preserve">INTEGER</w:t>
@@ -9987,8 +9987,8 @@
             <w:pPr>
               <w:pStyle w:val="Compact"/>
               <w:jc w:val="left"/>
-              <w:ind w:firstLine="0" w:right="0" w:left="0"/>
-              <w:spacing w:line="240" w:before="40" w:after="40" w:lineRule="auto"/>
+              <w:ind w:right="0" w:firstLine="0" w:left="0"/>
+              <w:spacing w:before="40" w:lineRule="auto" w:line="240" w:after="40"/>
             </w:pPr>
             <w:r>
               <w:t xml:space="preserve">Whole number</w:t>
@@ -10001,8 +10001,8 @@
             <w:pPr>
               <w:pStyle w:val="Compact"/>
               <w:jc w:val="left"/>
-              <w:ind w:firstLine="0" w:right="0" w:left="0"/>
-              <w:spacing w:line="240" w:before="40" w:after="40" w:lineRule="auto"/>
+              <w:ind w:right="0" w:firstLine="0" w:left="0"/>
+              <w:spacing w:before="40" w:lineRule="auto" w:line="240" w:after="40"/>
             </w:pPr>
             <w:r>
               <w:t xml:space="preserve">Numeric value (supports min/max bounds)</w:t>
@@ -10017,8 +10017,8 @@
             <w:pPr>
               <w:pStyle w:val="Compact"/>
               <w:jc w:val="left"/>
-              <w:ind w:firstLine="0" w:right="0" w:left="0"/>
-              <w:spacing w:line="240" w:before="40" w:after="40" w:lineRule="auto"/>
+              <w:ind w:right="0" w:firstLine="0" w:left="0"/>
+              <w:spacing w:before="40" w:lineRule="auto" w:line="240" w:after="40"/>
             </w:pPr>
             <w:r>
               <w:t xml:space="preserve">REAL</w:t>
@@ -10031,8 +10031,8 @@
             <w:pPr>
               <w:pStyle w:val="Compact"/>
               <w:jc w:val="left"/>
-              <w:ind w:firstLine="0" w:right="0" w:left="0"/>
-              <w:spacing w:line="240" w:before="40" w:after="40" w:lineRule="auto"/>
+              <w:ind w:right="0" w:firstLine="0" w:left="0"/>
+              <w:spacing w:before="40" w:lineRule="auto" w:line="240" w:after="40"/>
             </w:pPr>
             <w:r>
               <w:t xml:space="preserve">Decimal number</w:t>
@@ -10045,8 +10045,8 @@
             <w:pPr>
               <w:pStyle w:val="Compact"/>
               <w:jc w:val="left"/>
-              <w:ind w:firstLine="0" w:right="0" w:left="0"/>
-              <w:spacing w:line="240" w:before="40" w:after="40" w:lineRule="auto"/>
+              <w:ind w:right="0" w:firstLine="0" w:left="0"/>
+              <w:spacing w:before="40" w:lineRule="auto" w:line="240" w:after="40"/>
             </w:pPr>
             <w:r>
               <w:t xml:space="preserve">Floating-point value (supports min/max bounds)</w:t>
@@ -10061,8 +10061,8 @@
             <w:pPr>
               <w:pStyle w:val="Compact"/>
               <w:jc w:val="left"/>
-              <w:ind w:firstLine="0" w:right="0" w:left="0"/>
-              <w:spacing w:line="240" w:before="40" w:after="40" w:lineRule="auto"/>
+              <w:ind w:right="0" w:firstLine="0" w:left="0"/>
+              <w:spacing w:before="40" w:lineRule="auto" w:line="240" w:after="40"/>
             </w:pPr>
             <w:r>
               <w:t xml:space="preserve">BOOLEAN</w:t>
@@ -10075,8 +10075,8 @@
             <w:pPr>
               <w:pStyle w:val="Compact"/>
               <w:jc w:val="left"/>
-              <w:ind w:firstLine="0" w:right="0" w:left="0"/>
-              <w:spacing w:line="240" w:before="40" w:after="40" w:lineRule="auto"/>
+              <w:ind w:right="0" w:firstLine="0" w:left="0"/>
+              <w:spacing w:before="40" w:lineRule="auto" w:line="240" w:after="40"/>
             </w:pPr>
             <w:r>
               <w:t xml:space="preserve">true / false</w:t>
@@ -10089,8 +10089,8 @@
             <w:pPr>
               <w:pStyle w:val="Compact"/>
               <w:jc w:val="left"/>
-              <w:ind w:firstLine="0" w:right="0" w:left="0"/>
-              <w:spacing w:line="240" w:before="40" w:after="40" w:lineRule="auto"/>
+              <w:ind w:right="0" w:firstLine="0" w:left="0"/>
+              <w:spacing w:before="40" w:lineRule="auto" w:line="240" w:after="40"/>
             </w:pPr>
             <w:r>
               <w:t xml:space="preserve">Boolean flag</w:t>
@@ -10105,8 +10105,8 @@
             <w:pPr>
               <w:pStyle w:val="Compact"/>
               <w:jc w:val="left"/>
-              <w:ind w:firstLine="0" w:right="0" w:left="0"/>
-              <w:spacing w:line="240" w:before="40" w:after="40" w:lineRule="auto"/>
+              <w:ind w:right="0" w:firstLine="0" w:left="0"/>
+              <w:spacing w:before="40" w:lineRule="auto" w:line="240" w:after="40"/>
             </w:pPr>
             <w:r>
               <w:t xml:space="preserve">DATE</w:t>
@@ -10119,8 +10119,8 @@
             <w:pPr>
               <w:pStyle w:val="Compact"/>
               <w:jc w:val="left"/>
-              <w:ind w:firstLine="0" w:right="0" w:left="0"/>
-              <w:spacing w:line="240" w:before="40" w:after="40" w:lineRule="auto"/>
+              <w:ind w:right="0" w:firstLine="0" w:left="0"/>
+              <w:spacing w:before="40" w:lineRule="auto" w:line="240" w:after="40"/>
             </w:pPr>
             <w:r>
               <w:t xml:space="preserve">YYYY-MM-DD</w:t>
@@ -10133,8 +10133,8 @@
             <w:pPr>
               <w:pStyle w:val="Compact"/>
               <w:jc w:val="left"/>
-              <w:ind w:firstLine="0" w:right="0" w:left="0"/>
-              <w:spacing w:line="240" w:before="40" w:after="40" w:lineRule="auto"/>
+              <w:ind w:right="0" w:firstLine="0" w:left="0"/>
+              <w:spacing w:before="40" w:lineRule="auto" w:line="240" w:after="40"/>
             </w:pPr>
             <w:r>
               <w:t xml:space="preserve">ISO 8601 date</w:t>
@@ -10149,8 +10149,8 @@
             <w:pPr>
               <w:pStyle w:val="Compact"/>
               <w:jc w:val="left"/>
-              <w:ind w:firstLine="0" w:right="0" w:left="0"/>
-              <w:spacing w:line="240" w:before="40" w:after="40" w:lineRule="auto"/>
+              <w:ind w:right="0" w:firstLine="0" w:left="0"/>
+              <w:spacing w:before="40" w:lineRule="auto" w:line="240" w:after="40"/>
             </w:pPr>
             <w:r>
               <w:t xml:space="preserve">ENUM</w:t>
@@ -10163,8 +10163,8 @@
             <w:pPr>
               <w:pStyle w:val="Compact"/>
               <w:jc w:val="left"/>
-              <w:ind w:firstLine="0" w:right="0" w:left="0"/>
-              <w:spacing w:line="240" w:before="40" w:after="40" w:lineRule="auto"/>
+              <w:ind w:right="0" w:firstLine="0" w:left="0"/>
+              <w:spacing w:before="40" w:lineRule="auto" w:line="240" w:after="40"/>
             </w:pPr>
             <w:r>
               <w:t xml:space="preserve">Named value</w:t>
@@ -10177,8 +10177,8 @@
             <w:pPr>
               <w:pStyle w:val="Compact"/>
               <w:jc w:val="left"/>
-              <w:ind w:firstLine="0" w:right="0" w:left="0"/>
-              <w:spacing w:line="240" w:before="40" w:after="40" w:lineRule="auto"/>
+              <w:ind w:right="0" w:firstLine="0" w:left="0"/>
+              <w:spacing w:before="40" w:lineRule="auto" w:line="240" w:after="40"/>
             </w:pPr>
             <w:r>
               <w:t xml:space="preserve">One of a model-declared set of values</w:t>
@@ -10193,8 +10193,8 @@
             <w:pPr>
               <w:pStyle w:val="Compact"/>
               <w:jc w:val="left"/>
-              <w:ind w:firstLine="0" w:right="0" w:left="0"/>
-              <w:spacing w:line="240" w:before="40" w:after="40" w:lineRule="auto"/>
+              <w:ind w:right="0" w:firstLine="0" w:left="0"/>
+              <w:spacing w:before="40" w:lineRule="auto" w:line="240" w:after="40"/>
             </w:pPr>
             <w:r>
               <w:t xml:space="preserve">XHTML</w:t>
@@ -10207,8 +10207,8 @@
             <w:pPr>
               <w:pStyle w:val="Compact"/>
               <w:jc w:val="left"/>
-              <w:ind w:firstLine="0" w:right="0" w:left="0"/>
-              <w:spacing w:line="240" w:before="40" w:after="40" w:lineRule="auto"/>
+              <w:ind w:right="0" w:firstLine="0" w:left="0"/>
+              <w:spacing w:before="40" w:lineRule="auto" w:line="240" w:after="40"/>
             </w:pPr>
             <w:r>
               <w:t xml:space="preserve">Markdown text</w:t>
@@ -10221,8 +10221,8 @@
             <w:pPr>
               <w:pStyle w:val="Compact"/>
               <w:jc w:val="left"/>
-              <w:ind w:firstLine="0" w:right="0" w:left="0"/>
-              <w:spacing w:line="240" w:before="40" w:after="40" w:lineRule="auto"/>
+              <w:ind w:right="0" w:firstLine="0" w:left="0"/>
+              <w:spacing w:before="40" w:lineRule="auto" w:line="240" w:after="40"/>
             </w:pPr>
             <w:r>
               <w:t xml:space="preserve">Rich text preserving block and inline formatting</w:t>
@@ -10744,9 +10744,9 @@
     </w:p>
     <w:bookmarkEnd w:id="91"/>
     <w:sectPr>
-      <w:footerReference w:type="default" r:id="rId9200"/>
-      <w:headerReference w:type="default" r:id="rId9101"/>
-      <w:headerReference w:type="first" r:id="rId9100"/>
+      <w:footerReference r:id="rId9200" w:type="default"/>
+      <w:headerReference r:id="rId9101" w:type="default"/>
+      <w:headerReference r:id="rId9100" w:type="first"/>
       <w:titlePg/>
     </w:sectPr>
   </w:body>
@@ -10758,17 +10758,17 @@
 </file>
 
 <file path=word/footer1.xml><?xml version="1.0" encoding="utf-8"?>
-<w:ftr xmlns:r="http://schemas.openxmlformats.org/officeDocument/2006/relationships" xmlns:w="http://schemas.openxmlformats.org/wordprocessingml/2006/main">
+<w:ftr xmlns:w="http://schemas.openxmlformats.org/wordprocessingml/2006/main" xmlns:r="http://schemas.openxmlformats.org/officeDocument/2006/relationships">
   <w:tbl>
     <w:tblPr>
-      <w:tblW w:type="pct" w:w="5000"/>
+      <w:tblW w:w="5000" w:type="pct"/>
       <w:tblBorders>
-        <w:top w:val="single" w:space="1" w:color="CCCCCC" w:sz="4"/>
-        <w:bottom w:val="none" w:space="0" w:color="auto" w:sz="0"/>
-        <w:left w:val="none" w:space="0" w:color="auto" w:sz="0"/>
-        <w:right w:val="none" w:space="0" w:color="auto" w:sz="0"/>
-        <w:insideH w:val="none" w:space="0" w:color="auto" w:sz="0"/>
-        <w:insideV w:val="none" w:space="0" w:color="auto" w:sz="0"/>
+        <w:top w:sz="4" w:space="1" w:color="CCCCCC" w:val="single"/>
+        <w:bottom w:sz="0" w:space="0" w:color="auto" w:val="none"/>
+        <w:left w:sz="0" w:space="0" w:color="auto" w:val="none"/>
+        <w:right w:sz="0" w:space="0" w:color="auto" w:val="none"/>
+        <w:insideH w:sz="0" w:space="0" w:color="auto" w:val="none"/>
+        <w:insideV w:sz="0" w:space="0" w:color="auto" w:val="none"/>
       </w:tblBorders>
       <w:tblLayout w:type="fixed"/>
     </w:tblPr>
@@ -10780,7 +10780,7 @@
     <w:tr>
       <w:tc>
         <w:tcPr>
-          <w:tcW w:type="pct" w:w="1667"/>
+          <w:tcW w:w="1667" w:type="pct"/>
         </w:tcPr>
         <w:p>
           <w:pPr>
@@ -10794,7 +10794,7 @@
       </w:tc>
       <w:tc>
         <w:tcPr>
-          <w:tcW w:type="pct" w:w="1667"/>
+          <w:tcW w:w="1667" w:type="pct"/>
         </w:tcPr>
         <w:p>
           <w:pPr>
@@ -10808,7 +10808,7 @@
       </w:tc>
       <w:tc>
         <w:tcPr>
-          <w:tcW w:type="pct" w:w="1667"/>
+          <w:tcW w:w="1667" w:type="pct"/>
         </w:tcPr>
         <w:p>
           <w:pPr>
@@ -10884,7 +10884,7 @@
 </file>
 
 <file path=word/header1.xml><?xml version="1.0" encoding="utf-8"?>
-<w:hdr xmlns:r="http://schemas.openxmlformats.org/officeDocument/2006/relationships" xmlns:w="http://schemas.openxmlformats.org/wordprocessingml/2006/main">
+<w:hdr xmlns:w="http://schemas.openxmlformats.org/wordprocessingml/2006/main" xmlns:r="http://schemas.openxmlformats.org/officeDocument/2006/relationships">
   <w:p>
     <w:pPr>
       <w:pStyle w:val="Header"/>
@@ -10894,7 +10894,7 @@
 </file>
 
 <file path=word/header2.xml><?xml version="1.0" encoding="utf-8"?>
-<w:hdr xmlns:r="http://schemas.openxmlformats.org/officeDocument/2006/relationships" xmlns:w="http://schemas.openxmlformats.org/wordprocessingml/2006/main">
+<w:hdr xmlns:w="http://schemas.openxmlformats.org/wordprocessingml/2006/main" xmlns:r="http://schemas.openxmlformats.org/officeDocument/2006/relationships">
   <w:p>
     <w:pPr>
       <w:pStyle w:val="Header"/>
@@ -10937,7 +10937,7 @@
       <w:lvlText w:val="%1"/>
       <w:lvlJc w:val="left"/>
       <w:pPr>
-        <w:ind w:hanging="0" w:left="0"/>
+        <w:ind w:left="0" w:hanging="0"/>
       </w:pPr>
     </w:lvl>
     <w:lvl w:ilvl="1">
@@ -10949,7 +10949,7 @@
       <w:lvlText w:val="%1.%2"/>
       <w:lvlJc w:val="left"/>
       <w:pPr>
-        <w:ind w:hanging="0" w:left="0"/>
+        <w:ind w:left="0" w:hanging="0"/>
       </w:pPr>
     </w:lvl>
     <w:lvl w:ilvl="2">
@@ -10961,7 +10961,7 @@
       <w:lvlText w:val="%1.%2.%3"/>
       <w:lvlJc w:val="left"/>
       <w:pPr>
-        <w:ind w:hanging="0" w:left="0"/>
+        <w:ind w:left="0" w:hanging="0"/>
       </w:pPr>
     </w:lvl>
     <w:lvl w:ilvl="3">
@@ -10973,7 +10973,7 @@
       <w:lvlText w:val="%1.%2.%3.%4"/>
       <w:lvlJc w:val="left"/>
       <w:pPr>
-        <w:ind w:hanging="0" w:left="0"/>
+        <w:ind w:left="0" w:hanging="0"/>
       </w:pPr>
     </w:lvl>
     <w:lvl w:ilvl="4">
@@ -10985,7 +10985,7 @@
       <w:lvlText w:val="%1.%2.%3.%4.%5"/>
       <w:lvlJc w:val="left"/>
       <w:pPr>
-        <w:ind w:hanging="0" w:left="0"/>
+        <w:ind w:left="0" w:hanging="0"/>
       </w:pPr>
     </w:lvl>
   </w:abstractNum>
@@ -12169,18 +12169,18 @@
     <w:basedOn w:val="VerbatimChar"/>
     <w:rPr/>
   </w:style>
-  <w:style w:styleId="SpecObjectHeader" w:customStyle="1" w:type="paragraph">
+  <w:style w:customStyle="1" w:styleId="SpecObjectHeader" w:type="paragraph">
     <w:name w:val="Spec Object Header"/>
     <w:basedOn w:val="Normal"/>
     <w:next w:val="FirstParagraph"/>
     <w:qFormat/>
     <w:pPr>
       <w:keepNext/>
-      <w:spacing w:line="276" w:before="280" w:after="120" w:lineRule="auto"/>
+      <w:spacing w:before="280" w:lineRule="auto" w:line="276" w:after="120"/>
       <w:outlineLvl w:val="0"/>
     </w:pPr>
     <w:rPr>
-      <w:rFonts w:ascii="Calibri Light" w:cs="Calibri Light" w:hAnsi="Calibri Light"/>
+      <w:rFonts w:cs="Calibri Light" w:hAnsi="Calibri Light" w:ascii="Calibri Light"/>
       <w:b/>
       <w:bCs/>
       <w:color w:val="0F4C64"/>

</xml_diff>